<commit_message>
Widen midterm answer blanks while keeping four pages.
Expand fill-in underlines, add writing lines for word/calc items, and rebalance page breaks so kids have room to write.

Co-authored-by: Cursor <cursoragent@cursor.com>
</commit_message>
<xml_diff>
--- a/printables/midterm/A-期中综合练习卷/期中综合练习卷.docx
+++ b/printables/midterm/A-期中综合练习卷/期中综合练习卷.docx
@@ -4,7 +4,7 @@
   <w:body>
     <w:p>
       <w:pPr>
-        <w:spacing w:after="40" w:line="300" w:lineRule="auto"/>
+        <w:spacing w:after="40" w:line="307" w:lineRule="auto"/>
         <w:jc w:val="center"/>
         <w:rPr>
           <w:rFonts w:hint="eastAsia"/>
@@ -53,7 +53,7 @@
     </w:p>
     <w:p>
       <w:pPr>
-        <w:spacing w:after="40" w:line="300" w:lineRule="auto"/>
+        <w:spacing w:after="40" w:line="307" w:lineRule="auto"/>
         <w:jc w:val="center"/>
         <w:rPr>
           <w:rFonts w:hint="eastAsia"/>
@@ -111,7 +111,7 @@
     </w:p>
     <w:p>
       <w:pPr>
-        <w:spacing w:after="80" w:line="300" w:lineRule="auto"/>
+        <w:spacing w:after="80" w:line="307" w:lineRule="auto"/>
         <w:jc w:val="center"/>
         <w:rPr>
           <w:rFonts w:hint="eastAsia"/>
@@ -156,7 +156,7 @@
     </w:p>
     <w:p>
       <w:pPr>
-        <w:spacing w:after="120" w:line="300" w:lineRule="auto"/>
+        <w:spacing w:after="80" w:line="307" w:lineRule="auto"/>
         <w:rPr>
           <w:rFonts w:hint="eastAsia"/>
         </w:rPr>
@@ -213,7 +213,7 @@
     </w:p>
     <w:p>
       <w:pPr>
-        <w:spacing w:after="60" w:line="300" w:lineRule="auto"/>
+        <w:spacing w:after="80" w:line="307" w:lineRule="auto"/>
         <w:rPr>
           <w:rFonts w:hint="eastAsia"/>
         </w:rPr>
@@ -245,7 +245,7 @@
     </w:p>
     <w:p>
       <w:pPr>
-        <w:spacing w:after="60" w:line="300" w:lineRule="auto"/>
+        <w:spacing w:after="80" w:line="307" w:lineRule="auto"/>
         <w:rPr>
           <w:rFonts w:hint="eastAsia"/>
         </w:rPr>
@@ -256,7 +256,7 @@
     </w:p>
     <w:p>
       <w:pPr>
-        <w:spacing w:after="60" w:line="300" w:lineRule="auto"/>
+        <w:spacing w:after="80" w:line="307" w:lineRule="auto"/>
         <w:rPr>
           <w:rFonts w:hint="eastAsia"/>
         </w:rPr>
@@ -270,7 +270,7 @@
     </w:p>
     <w:p>
       <w:pPr>
-        <w:spacing w:after="80" w:line="300" w:lineRule="auto"/>
+        <w:spacing w:after="80" w:line="307" w:lineRule="auto"/>
         <w:rPr>
           <w:rFonts w:hint="eastAsia"/>
         </w:rPr>
@@ -281,7 +281,7 @@
     </w:p>
     <w:p>
       <w:pPr>
-        <w:spacing w:after="60" w:line="300" w:lineRule="auto"/>
+        <w:spacing w:after="80" w:line="307" w:lineRule="auto"/>
         <w:rPr>
           <w:rFonts w:hint="eastAsia"/>
         </w:rPr>
@@ -304,7 +304,7 @@
     </w:p>
     <w:p>
       <w:pPr>
-        <w:spacing w:after="40" w:line="300" w:lineRule="auto"/>
+        <w:spacing w:after="40" w:line="307" w:lineRule="auto"/>
         <w:rPr>
           <w:rFonts w:hint="eastAsia"/>
         </w:rPr>
@@ -318,7 +318,7 @@
     </w:p>
     <w:p>
       <w:pPr>
-        <w:spacing w:after="40" w:line="300" w:lineRule="auto"/>
+        <w:spacing w:after="40" w:line="307" w:lineRule="auto"/>
         <w:rPr>
           <w:rFonts w:hint="eastAsia"/>
         </w:rPr>
@@ -332,30 +332,55 @@
     </w:p>
     <w:p>
       <w:pPr>
-        <w:spacing w:after="60" w:line="300" w:lineRule="auto"/>
+        <w:spacing w:before="120" w:after="60" w:line="307" w:lineRule="auto"/>
         <w:rPr>
           <w:rFonts w:hint="eastAsia"/>
         </w:rPr>
       </w:pPr>
       <w:r>
+        <w:rPr>
+          <w:rFonts w:ascii="黑体" w:eastAsia="黑体" w:hAnsi="黑体"/>
+          <w:b/>
+          <w:sz w:val="22"/>
+        </w:rPr>
         <w:t>一、填空题。（每空</w:t>
       </w:r>
       <w:r>
+        <w:rPr>
+          <w:rFonts w:ascii="黑体" w:eastAsia="黑体" w:hAnsi="黑体"/>
+          <w:b/>
+          <w:sz w:val="22"/>
+        </w:rPr>
         <w:t xml:space="preserve"> 1 </w:t>
       </w:r>
       <w:r>
+        <w:rPr>
+          <w:rFonts w:ascii="黑体" w:eastAsia="黑体" w:hAnsi="黑体"/>
+          <w:b/>
+          <w:sz w:val="22"/>
+        </w:rPr>
         <w:t>分，共</w:t>
       </w:r>
       <w:r>
+        <w:rPr>
+          <w:rFonts w:ascii="黑体" w:eastAsia="黑体" w:hAnsi="黑体"/>
+          <w:b/>
+          <w:sz w:val="22"/>
+        </w:rPr>
         <w:t xml:space="preserve"> 27 </w:t>
       </w:r>
       <w:r>
+        <w:rPr>
+          <w:rFonts w:ascii="黑体" w:eastAsia="黑体" w:hAnsi="黑体"/>
+          <w:b/>
+          <w:sz w:val="22"/>
+        </w:rPr>
         <w:t>分）</w:t>
       </w:r>
     </w:p>
     <w:p>
       <w:pPr>
-        <w:spacing w:after="80" w:line="300" w:lineRule="auto"/>
+        <w:spacing w:after="120" w:line="307" w:lineRule="auto"/>
         <w:rPr>
           <w:rFonts w:hint="eastAsia"/>
         </w:rPr>
@@ -364,7 +389,13 @@
         <w:t>1. 450× 16</w:t>
       </w:r>
       <w:r>
-        <w:t>，积的末尾有（　　）个</w:t>
+        <w:t>，积的末尾有（</w:t>
+      </w:r>
+      <w:r>
+        <w:t>________</w:t>
+      </w:r>
+      <w:r>
+        <w:t>）个</w:t>
       </w:r>
       <w:r>
         <w:t xml:space="preserve"> 0</w:t>
@@ -376,425 +407,513 @@
         <w:t>204× 15</w:t>
       </w:r>
       <w:r>
-        <w:t>，积的末尾有（　　）个</w:t>
+        <w:t>，积的末尾有（</w:t>
+      </w:r>
+      <w:r>
+        <w:t>________</w:t>
+      </w:r>
+      <w:r>
+        <w:t>）个</w:t>
       </w:r>
       <w:r>
         <w:t xml:space="preserve"> 0</w:t>
       </w:r>
       <w:r>
-        <w:t>，它的积是（　　）位数。</w:t>
+        <w:t>，它的积是（</w:t>
+      </w:r>
+      <w:r>
+        <w:t>________</w:t>
+      </w:r>
+      <w:r>
+        <w:t>）位数。</w:t>
       </w:r>
     </w:p>
     <w:p>
       <w:pPr>
-        <w:spacing w:after="80" w:line="300" w:lineRule="auto"/>
+        <w:spacing w:after="320" w:line="240" w:lineRule="auto"/>
         <w:rPr>
           <w:rFonts w:hint="eastAsia"/>
         </w:rPr>
       </w:pPr>
-      <w:r>
-        <w:t xml:space="preserve">2. </w:t>
-      </w:r>
-      <w:r>
-        <w:t>在</w:t>
-      </w:r>
-      <w:r>
-        <w:t xml:space="preserve"> ○ </w:t>
-      </w:r>
-      <w:r>
-        <w:t>里填上</w:t>
-      </w:r>
-      <w:r>
-        <w:t>“&gt;”“&lt;”</w:t>
-      </w:r>
-      <w:r>
-        <w:t>或</w:t>
-      </w:r>
-      <w:r>
-        <w:t>“=”</w:t>
-      </w:r>
-      <w:r>
-        <w:t>。</w:t>
-      </w:r>
     </w:p>
     <w:p>
       <w:pPr>
-        <w:spacing w:after="60" w:line="300" w:lineRule="auto"/>
+        <w:spacing w:after="120" w:line="307" w:lineRule="auto"/>
         <w:rPr>
           <w:rFonts w:hint="eastAsia"/>
         </w:rPr>
       </w:pPr>
       <w:r>
-        <w:t>45× 32 ○ 54× 32</w:t>
-      </w:r>
-      <w:r>
-        <w:t xml:space="preserve">　　</w:t>
-      </w:r>
-      <w:r>
-        <w:t>460× 23 ○ 230× 92</w:t>
-      </w:r>
-      <w:r>
-        <w:t xml:space="preserve">　　</w:t>
-      </w:r>
-      <w:r>
-        <w:t>380× 45 ○ 19× 900</w:t>
+        <w:t xml:space="preserve">2. </w:t>
+      </w:r>
+      <w:r>
+        <w:t>在</w:t>
+      </w:r>
+      <w:r>
+        <w:t xml:space="preserve"> ○ </w:t>
+      </w:r>
+      <w:r>
+        <w:t>里填上</w:t>
+      </w:r>
+      <w:r>
+        <w:t>“&gt;”“&lt;”</w:t>
+      </w:r>
+      <w:r>
+        <w:t>或</w:t>
+      </w:r>
+      <w:r>
+        <w:t>“=”</w:t>
+      </w:r>
+      <w:r>
+        <w:t>。</w:t>
       </w:r>
     </w:p>
     <w:p>
       <w:pPr>
-        <w:spacing w:after="60" w:line="300" w:lineRule="auto"/>
+        <w:spacing w:after="80" w:line="307" w:lineRule="auto"/>
         <w:rPr>
           <w:rFonts w:hint="eastAsia"/>
         </w:rPr>
       </w:pPr>
       <w:r>
-        <w:t>54× 47 ○ 47× 54</w:t>
+        <w:t>45× 32 ○ 54× 32</w:t>
       </w:r>
       <w:r>
         <w:t xml:space="preserve">　　</w:t>
       </w:r>
       <w:r>
-        <w:t>500× 99 ○ 101× 50</w:t>
+        <w:t>460× 23 ○ 230× 92</w:t>
       </w:r>
       <w:r>
         <w:t xml:space="preserve">　　</w:t>
       </w:r>
       <w:r>
-        <w:t>19× 400 ○ 40× 80</w:t>
+        <w:t>380× 45 ○ 19× 900</w:t>
       </w:r>
     </w:p>
     <w:p>
       <w:pPr>
-        <w:spacing w:after="80" w:line="300" w:lineRule="auto"/>
+        <w:spacing w:after="80" w:line="307" w:lineRule="auto"/>
         <w:rPr>
           <w:rFonts w:hint="eastAsia"/>
         </w:rPr>
       </w:pPr>
       <w:r>
-        <w:t xml:space="preserve">3. </w:t>
-      </w:r>
-      <w:r>
-        <w:t>把下列各数按从小到大的顺序排列。</w:t>
+        <w:t>54× 47 ○ 47× 54</w:t>
+      </w:r>
+      <w:r>
+        <w:t xml:space="preserve">　　</w:t>
+      </w:r>
+      <w:r>
+        <w:t>500× 99 ○ 101× 50</w:t>
+      </w:r>
+      <w:r>
+        <w:t xml:space="preserve">　　</w:t>
+      </w:r>
+      <w:r>
+        <w:t>19× 400 ○ 40× 80</w:t>
       </w:r>
     </w:p>
     <w:p>
       <w:pPr>
-        <w:spacing w:after="60" w:line="300" w:lineRule="auto"/>
+        <w:spacing w:after="320" w:line="240" w:lineRule="auto"/>
         <w:rPr>
           <w:rFonts w:hint="eastAsia"/>
         </w:rPr>
       </w:pPr>
-      <w:r>
-        <w:t>4600340</w:t>
-      </w:r>
-      <w:r>
-        <w:t xml:space="preserve">　　</w:t>
-      </w:r>
-      <w:r>
-        <w:t>221076000</w:t>
-      </w:r>
-      <w:r>
-        <w:t xml:space="preserve">　　</w:t>
-      </w:r>
-      <w:r>
-        <w:t>5002190</w:t>
-      </w:r>
-      <w:r>
-        <w:t xml:space="preserve">　　</w:t>
-      </w:r>
-      <w:r>
-        <w:t>970968</w:t>
-      </w:r>
-      <w:r>
-        <w:t xml:space="preserve">　　</w:t>
-      </w:r>
-      <w:r>
-        <w:t>4600430</w:t>
-      </w:r>
     </w:p>
     <w:p>
       <w:pPr>
-        <w:spacing w:after="80" w:line="300" w:lineRule="auto"/>
+        <w:spacing w:after="120" w:line="307" w:lineRule="auto"/>
         <w:rPr>
           <w:rFonts w:hint="eastAsia"/>
         </w:rPr>
       </w:pPr>
       <w:r>
-        <w:t>（　　）</w:t>
-      </w:r>
-      <w:r>
-        <w:t>&lt;</w:t>
-      </w:r>
-      <w:r>
-        <w:t>（　　）</w:t>
-      </w:r>
-      <w:r>
-        <w:t>&lt;</w:t>
-      </w:r>
-      <w:r>
-        <w:t>（　　）</w:t>
-      </w:r>
-      <w:r>
-        <w:t>&lt;</w:t>
-      </w:r>
-      <w:r>
-        <w:t>（　　）</w:t>
-      </w:r>
-      <w:r>
-        <w:t>&lt;</w:t>
-      </w:r>
-      <w:r>
-        <w:t>（　　）</w:t>
+        <w:t xml:space="preserve">3. </w:t>
+      </w:r>
+      <w:r>
+        <w:t>把下列各数按从小到大的顺序排列。</w:t>
       </w:r>
     </w:p>
     <w:p>
       <w:pPr>
-        <w:spacing w:after="80" w:line="300" w:lineRule="auto"/>
+        <w:spacing w:after="80" w:line="307" w:lineRule="auto"/>
         <w:rPr>
           <w:rFonts w:hint="eastAsia"/>
         </w:rPr>
       </w:pPr>
       <w:r>
-        <w:t xml:space="preserve">4. </w:t>
-      </w:r>
-      <w:r>
-        <w:t>钟面上，从</w:t>
-      </w:r>
-      <w:r>
-        <w:t xml:space="preserve"> 8:00 </w:t>
-      </w:r>
-      <w:r>
-        <w:t>到</w:t>
-      </w:r>
-      <w:r>
-        <w:t xml:space="preserve"> 8:15</w:t>
-      </w:r>
-      <w:r>
-        <w:t>，分针转动了（　　）</w:t>
-      </w:r>
-      <w:r>
-        <w:t>°</w:t>
-      </w:r>
-      <w:r>
-        <w:t>，转过的角是（　　）角；如果时针和分针形成的角是平角，此时可能是（　　）时整。</w:t>
+        <w:t>4600340</w:t>
+      </w:r>
+      <w:r>
+        <w:t xml:space="preserve">　　</w:t>
+      </w:r>
+      <w:r>
+        <w:t>221076000</w:t>
+      </w:r>
+      <w:r>
+        <w:t xml:space="preserve">　　</w:t>
+      </w:r>
+      <w:r>
+        <w:t>5002190</w:t>
+      </w:r>
+      <w:r>
+        <w:t xml:space="preserve">　　</w:t>
+      </w:r>
+      <w:r>
+        <w:t>970968</w:t>
+      </w:r>
+      <w:r>
+        <w:t xml:space="preserve">　　</w:t>
+      </w:r>
+      <w:r>
+        <w:t>4600430</w:t>
       </w:r>
     </w:p>
     <w:p>
       <w:pPr>
-        <w:spacing w:after="80" w:line="300" w:lineRule="auto"/>
+        <w:spacing w:after="80" w:line="307" w:lineRule="auto"/>
         <w:rPr>
           <w:rFonts w:hint="eastAsia"/>
         </w:rPr>
       </w:pPr>
       <w:r>
-        <w:t xml:space="preserve">5. </w:t>
-      </w:r>
-      <w:r>
-        <w:t>一个九位数的密码，个位上的数字是</w:t>
-      </w:r>
-      <w:r>
-        <w:t xml:space="preserve"> 2</w:t>
-      </w:r>
-      <w:r>
-        <w:t>，百位上的数字是个位上数字的</w:t>
-      </w:r>
-      <w:r>
-        <w:t xml:space="preserve"> 3 </w:t>
-      </w:r>
-      <w:r>
-        <w:t>倍，任意相邻三个数位上的数字之和是</w:t>
-      </w:r>
-      <w:r>
-        <w:t xml:space="preserve"> 12</w:t>
-      </w:r>
-      <w:r>
-        <w:t>。这个九位数的密码是（　　）。</w:t>
+        <w:t>（</w:t>
+      </w:r>
+      <w:r>
+        <w:t>________</w:t>
+      </w:r>
+      <w:r>
+        <w:t>）</w:t>
+      </w:r>
+      <w:r>
+        <w:t>&lt;</w:t>
+      </w:r>
+      <w:r>
+        <w:t>（</w:t>
+      </w:r>
+      <w:r>
+        <w:t>________</w:t>
+      </w:r>
+      <w:r>
+        <w:t>）</w:t>
+      </w:r>
+      <w:r>
+        <w:t>&lt;</w:t>
+      </w:r>
+      <w:r>
+        <w:t>（</w:t>
+      </w:r>
+      <w:r>
+        <w:t>________</w:t>
+      </w:r>
+      <w:r>
+        <w:t>）</w:t>
+      </w:r>
+      <w:r>
+        <w:t>&lt;</w:t>
+      </w:r>
+      <w:r>
+        <w:t>（</w:t>
+      </w:r>
+      <w:r>
+        <w:t>________</w:t>
+      </w:r>
+      <w:r>
+        <w:t>）</w:t>
+      </w:r>
+      <w:r>
+        <w:t>&lt;</w:t>
+      </w:r>
+      <w:r>
+        <w:t>（</w:t>
+      </w:r>
+      <w:r>
+        <w:t>________</w:t>
+      </w:r>
+      <w:r>
+        <w:t>）</w:t>
       </w:r>
     </w:p>
     <w:p>
       <w:pPr>
-        <w:spacing w:after="80" w:line="300" w:lineRule="auto"/>
+        <w:spacing w:after="320" w:line="240" w:lineRule="auto"/>
         <w:rPr>
           <w:rFonts w:hint="eastAsia"/>
         </w:rPr>
       </w:pPr>
-      <w:r>
-        <w:t xml:space="preserve">6. </w:t>
-      </w:r>
-      <w:r>
-        <w:t>如图，沿着直线</w:t>
-      </w:r>
-      <w:r>
-        <w:t xml:space="preserve"> l </w:t>
-      </w:r>
-      <w:r>
-        <w:t>摆了一副三角尺，那么</w:t>
-      </w:r>
-      <w:r>
-        <w:t xml:space="preserve"> ∠ 1=</w:t>
-      </w:r>
-      <w:r>
-        <w:t>（　　）</w:t>
-      </w:r>
-      <w:r>
-        <w:t>°</w:t>
-      </w:r>
-      <w:r>
-        <w:t>，</w:t>
-      </w:r>
-      <w:r>
-        <w:t>∠ 2=</w:t>
-      </w:r>
-      <w:r>
-        <w:t>（　　）</w:t>
-      </w:r>
-      <w:r>
-        <w:t>°</w:t>
-      </w:r>
-      <w:r>
-        <w:t>。</w:t>
-      </w:r>
     </w:p>
     <w:p>
       <w:pPr>
-        <w:spacing w:after="80" w:line="300" w:lineRule="auto"/>
+        <w:spacing w:after="120" w:line="307" w:lineRule="auto"/>
         <w:rPr>
           <w:rFonts w:hint="eastAsia"/>
         </w:rPr>
       </w:pPr>
       <w:r>
-        <w:rPr>
-          <w:color w:val="506E8C"/>
-          <w:sz w:val="19"/>
-        </w:rPr>
-        <w:t>【图：直线</w:t>
-      </w:r>
-      <w:r>
-        <w:rPr>
-          <w:color w:val="506E8C"/>
-          <w:sz w:val="19"/>
-        </w:rPr>
-        <w:t xml:space="preserve"> l</w:t>
-      </w:r>
-      <w:r>
-        <w:rPr>
-          <w:color w:val="506E8C"/>
-          <w:sz w:val="19"/>
-        </w:rPr>
-        <w:t>。直线上方放着一副三角尺。左边一把：底边贴在直线</w:t>
-      </w:r>
-      <w:r>
-        <w:rPr>
-          <w:color w:val="506E8C"/>
-          <w:sz w:val="19"/>
-        </w:rPr>
-        <w:t xml:space="preserve"> l </w:t>
-      </w:r>
-      <w:r>
-        <w:rPr>
-          <w:color w:val="506E8C"/>
-          <w:sz w:val="19"/>
-        </w:rPr>
-        <w:t>上，右侧为一条竖直边，斜边在左，三角形内画有直角符号。右边一把：左下角和右下角都落在直线</w:t>
-      </w:r>
-      <w:r>
-        <w:rPr>
-          <w:color w:val="506E8C"/>
-          <w:sz w:val="19"/>
-        </w:rPr>
-        <w:t xml:space="preserve"> l </w:t>
-      </w:r>
-      <w:r>
-        <w:rPr>
-          <w:color w:val="506E8C"/>
-          <w:sz w:val="19"/>
-        </w:rPr>
-        <w:t>上，左下角紧挨左边那把竖直边的下端；它靠左的一条边向上伸，与左边竖直边在上方相交，夹角标为</w:t>
-      </w:r>
-      <w:r>
-        <w:rPr>
-          <w:color w:val="506E8C"/>
-          <w:sz w:val="19"/>
-        </w:rPr>
-        <w:t xml:space="preserve"> 1</w:t>
-      </w:r>
-      <w:r>
-        <w:rPr>
-          <w:color w:val="506E8C"/>
-          <w:sz w:val="19"/>
-        </w:rPr>
-        <w:t>，三角形内也画有直角符号。</w:t>
-      </w:r>
-      <w:r>
-        <w:rPr>
-          <w:color w:val="506E8C"/>
-          <w:sz w:val="19"/>
-        </w:rPr>
-        <w:t xml:space="preserve">∠ 2 </w:t>
-      </w:r>
-      <w:r>
-        <w:rPr>
-          <w:color w:val="506E8C"/>
-          <w:sz w:val="19"/>
-        </w:rPr>
-        <w:t>标在直线</w:t>
-      </w:r>
-      <w:r>
-        <w:rPr>
-          <w:color w:val="506E8C"/>
-          <w:sz w:val="19"/>
-        </w:rPr>
-        <w:t xml:space="preserve"> l </w:t>
-      </w:r>
-      <w:r>
-        <w:rPr>
-          <w:color w:val="506E8C"/>
-          <w:sz w:val="19"/>
-        </w:rPr>
-        <w:t>下方，对准右边三角尺左下角与直线的交点。】</w:t>
+        <w:t xml:space="preserve">4. </w:t>
+      </w:r>
+      <w:r>
+        <w:t>钟面上，从</w:t>
+      </w:r>
+      <w:r>
+        <w:t xml:space="preserve"> 8:00 </w:t>
+      </w:r>
+      <w:r>
+        <w:t>到</w:t>
+      </w:r>
+      <w:r>
+        <w:t xml:space="preserve"> 8:15</w:t>
+      </w:r>
+      <w:r>
+        <w:t>，分针转动了（</w:t>
+      </w:r>
+      <w:r>
+        <w:t>________</w:t>
+      </w:r>
+      <w:r>
+        <w:t>）</w:t>
+      </w:r>
+      <w:r>
+        <w:t>°</w:t>
+      </w:r>
+      <w:r>
+        <w:t>，转过的角是（</w:t>
+      </w:r>
+      <w:r>
+        <w:t>________</w:t>
+      </w:r>
+      <w:r>
+        <w:t>）角；如果时针和分针形成的角是平角，此时可能是（</w:t>
+      </w:r>
+      <w:r>
+        <w:t>________</w:t>
+      </w:r>
+      <w:r>
+        <w:t>）时整。</w:t>
       </w:r>
     </w:p>
     <w:p>
       <w:pPr>
-        <w:spacing w:after="80" w:line="300" w:lineRule="auto"/>
+        <w:spacing w:after="320" w:line="240" w:lineRule="auto"/>
         <w:rPr>
           <w:rFonts w:hint="eastAsia"/>
         </w:rPr>
       </w:pPr>
-      <w:r>
-        <w:t xml:space="preserve">7. </w:t>
-      </w:r>
-      <w:r>
-        <w:t>小明在做三位数乘两位数的计算题时，把两位数</w:t>
-      </w:r>
-      <w:r>
-        <w:t xml:space="preserve"> 30 </w:t>
-      </w:r>
-      <w:r>
-        <w:t>个位上的</w:t>
-      </w:r>
-      <w:r>
-        <w:t xml:space="preserve"> 0 </w:t>
-      </w:r>
-      <w:r>
-        <w:t>看成了</w:t>
-      </w:r>
-      <w:r>
-        <w:t xml:space="preserve"> 6</w:t>
-      </w:r>
-      <w:r>
-        <w:t>，乘得的积比正确的积多</w:t>
-      </w:r>
-      <w:r>
-        <w:t xml:space="preserve"> 1080</w:t>
-      </w:r>
-      <w:r>
-        <w:t>，正确的积是（　　）。</w:t>
-      </w:r>
     </w:p>
     <w:p>
       <w:pPr>
-        <w:spacing w:before="160" w:after="0" w:line="300" w:lineRule="auto"/>
+        <w:spacing w:after="120" w:line="307" w:lineRule="auto"/>
+        <w:rPr>
+          <w:rFonts w:hint="eastAsia"/>
+        </w:rPr>
+      </w:pPr>
+      <w:r>
+        <w:t xml:space="preserve">5. </w:t>
+      </w:r>
+      <w:r>
+        <w:t>一个九位数的密码，个位上的数字是</w:t>
+      </w:r>
+      <w:r>
+        <w:t xml:space="preserve"> 2</w:t>
+      </w:r>
+      <w:r>
+        <w:t>，百位上的数字是个位上数字的</w:t>
+      </w:r>
+      <w:r>
+        <w:t xml:space="preserve"> 3 </w:t>
+      </w:r>
+      <w:r>
+        <w:t>倍，任意相邻三个数位上的数字之和是</w:t>
+      </w:r>
+      <w:r>
+        <w:t xml:space="preserve"> 12</w:t>
+      </w:r>
+      <w:r>
+        <w:t>。这个九位数的密码是（</w:t>
+      </w:r>
+      <w:r>
+        <w:t>________</w:t>
+      </w:r>
+      <w:r>
+        <w:t>）。</w:t>
+      </w:r>
+    </w:p>
+    <w:p>
+      <w:pPr>
+        <w:spacing w:after="320" w:line="240" w:lineRule="auto"/>
+        <w:rPr>
+          <w:rFonts w:hint="eastAsia"/>
+        </w:rPr>
+      </w:pPr>
+    </w:p>
+    <w:p>
+      <w:pPr>
+        <w:spacing w:after="120" w:line="307" w:lineRule="auto"/>
+        <w:rPr>
+          <w:rFonts w:hint="eastAsia"/>
+        </w:rPr>
+      </w:pPr>
+      <w:r>
+        <w:t xml:space="preserve">6. </w:t>
+      </w:r>
+      <w:r>
+        <w:t>如图，沿着直线</w:t>
+      </w:r>
+      <w:r>
+        <w:t xml:space="preserve"> l </w:t>
+      </w:r>
+      <w:r>
+        <w:t>摆了一副三角尺，那么</w:t>
+      </w:r>
+      <w:r>
+        <w:t xml:space="preserve"> ∠ 1=</w:t>
+      </w:r>
+      <w:r>
+        <w:t>（</w:t>
+      </w:r>
+      <w:r>
+        <w:t>________</w:t>
+      </w:r>
+      <w:r>
+        <w:t>）</w:t>
+      </w:r>
+      <w:r>
+        <w:t>°</w:t>
+      </w:r>
+      <w:r>
+        <w:t>，</w:t>
+      </w:r>
+      <w:r>
+        <w:t>∠ 2=</w:t>
+      </w:r>
+      <w:r>
+        <w:t>（</w:t>
+      </w:r>
+      <w:r>
+        <w:t>________</w:t>
+      </w:r>
+      <w:r>
+        <w:t>）</w:t>
+      </w:r>
+      <w:r>
+        <w:t>°</w:t>
+      </w:r>
+      <w:r>
+        <w:t>。</w:t>
+      </w:r>
+    </w:p>
+    <w:p>
+      <w:pPr>
+        <w:spacing w:after="40" w:line="264" w:lineRule="auto"/>
+        <w:rPr>
+          <w:rFonts w:hint="eastAsia"/>
+        </w:rPr>
+      </w:pPr>
+      <w:r>
+        <w:rPr>
+          <w:color w:val="506E8C"/>
+          <w:sz w:val="18"/>
+        </w:rPr>
+        <w:t>【图：直线</w:t>
+      </w:r>
+      <w:r>
+        <w:rPr>
+          <w:color w:val="506E8C"/>
+          <w:sz w:val="18"/>
+        </w:rPr>
+        <w:t xml:space="preserve"> l</w:t>
+      </w:r>
+      <w:r>
+        <w:rPr>
+          <w:color w:val="506E8C"/>
+          <w:sz w:val="18"/>
+        </w:rPr>
+        <w:t>。直线上方放着一副三角尺。左边一把：底边贴在直线</w:t>
+      </w:r>
+      <w:r>
+        <w:rPr>
+          <w:color w:val="506E8C"/>
+          <w:sz w:val="18"/>
+        </w:rPr>
+        <w:t xml:space="preserve"> l </w:t>
+      </w:r>
+      <w:r>
+        <w:rPr>
+          <w:color w:val="506E8C"/>
+          <w:sz w:val="18"/>
+        </w:rPr>
+        <w:t>上，右侧为一条竖直边，斜边在左，三角形内画有直角符号。右边一把：左下角和右下角都落在直线</w:t>
+      </w:r>
+      <w:r>
+        <w:rPr>
+          <w:color w:val="506E8C"/>
+          <w:sz w:val="18"/>
+        </w:rPr>
+        <w:t xml:space="preserve"> l </w:t>
+      </w:r>
+      <w:r>
+        <w:rPr>
+          <w:color w:val="506E8C"/>
+          <w:sz w:val="18"/>
+        </w:rPr>
+        <w:t>上，左下角紧挨左边那把竖直边的下端；它靠左的一条边向上伸，与左边竖直边在上方相交，夹角标为</w:t>
+      </w:r>
+      <w:r>
+        <w:rPr>
+          <w:color w:val="506E8C"/>
+          <w:sz w:val="18"/>
+        </w:rPr>
+        <w:t xml:space="preserve"> 1</w:t>
+      </w:r>
+      <w:r>
+        <w:rPr>
+          <w:color w:val="506E8C"/>
+          <w:sz w:val="18"/>
+        </w:rPr>
+        <w:t>，三角形内也画有直角符号。</w:t>
+      </w:r>
+      <w:r>
+        <w:rPr>
+          <w:color w:val="506E8C"/>
+          <w:sz w:val="18"/>
+        </w:rPr>
+        <w:t xml:space="preserve">∠ 2 </w:t>
+      </w:r>
+      <w:r>
+        <w:rPr>
+          <w:color w:val="506E8C"/>
+          <w:sz w:val="18"/>
+        </w:rPr>
+        <w:t>标在直线</w:t>
+      </w:r>
+      <w:r>
+        <w:rPr>
+          <w:color w:val="506E8C"/>
+          <w:sz w:val="18"/>
+        </w:rPr>
+        <w:t xml:space="preserve"> l </w:t>
+      </w:r>
+      <w:r>
+        <w:rPr>
+          <w:color w:val="506E8C"/>
+          <w:sz w:val="18"/>
+        </w:rPr>
+        <w:t>下方，对准右边三角尺左下角与直线的交点。】</w:t>
+      </w:r>
+    </w:p>
+    <w:p>
+      <w:pPr>
+        <w:spacing w:after="320" w:line="240" w:lineRule="auto"/>
+        <w:rPr>
+          <w:rFonts w:hint="eastAsia"/>
+        </w:rPr>
+      </w:pPr>
+    </w:p>
+    <w:p>
+      <w:pPr>
+        <w:spacing w:before="120" w:after="0"/>
         <w:jc w:val="center"/>
         <w:rPr>
           <w:rFonts w:hint="eastAsia"/>
@@ -885,213 +1004,269 @@
     </w:p>
     <w:p>
       <w:pPr>
-        <w:spacing w:after="80" w:line="300" w:lineRule="auto"/>
+        <w:spacing w:line="317" w:lineRule="auto"/>
         <w:rPr>
           <w:rFonts w:hint="eastAsia"/>
         </w:rPr>
       </w:pPr>
       <w:r>
-        <w:t>8. 将两个数分别“四舍五入”到万位后都是 40 万，一个数大于 40 万，另一个数小于 40 万，而且这两个数只相差 4，这两个数可能是（　　）和（　　）。</w:t>
+        <w:t>7. 小明在做三位数乘两位数的计算题时，把两位数 30 个位上的 0 看成了 6，乘得的积比正确的积多 1080，正确的积是（________）。</w:t>
       </w:r>
     </w:p>
     <w:p>
       <w:pPr>
-        <w:spacing w:after="80" w:line="300" w:lineRule="auto"/>
+        <w:spacing w:after="480" w:line="240" w:lineRule="auto"/>
         <w:rPr>
           <w:rFonts w:hint="eastAsia"/>
         </w:rPr>
       </w:pPr>
-      <w:r>
-        <w:t>9. 已知 △×☆=360，如果 △ 不变，☆ 扩大到原来的 5 倍，那么积变为（　　）。</w:t>
-      </w:r>
     </w:p>
     <w:p>
       <w:pPr>
-        <w:spacing w:after="80" w:line="300" w:lineRule="auto"/>
+        <w:spacing w:line="317" w:lineRule="auto"/>
         <w:rPr>
           <w:rFonts w:hint="eastAsia"/>
         </w:rPr>
       </w:pPr>
       <w:r>
-        <w:t>10. 某玩具店批发了 70 架玩具飞机，每架玩具飞机的进价是 118 元，这个玩具店在卖出 45 架后，开始以优惠价（如图）出售，剩下的玩具飞机全部卖出后，玩具店（　　）（填“赚”或“赔”）钱了。</w:t>
+        <w:t>8. 将两个数分别“四舍五入”到万位后都是 40 万，一个数大于 40 万，另一个数小于 40 万，而且这两个数只相差 4，这两个数可能是（________）和（________）。</w:t>
       </w:r>
     </w:p>
     <w:p>
       <w:pPr>
-        <w:spacing w:after="80" w:line="300" w:lineRule="auto"/>
+        <w:spacing w:after="480" w:line="240" w:lineRule="auto"/>
         <w:rPr>
           <w:rFonts w:hint="eastAsia"/>
         </w:rPr>
       </w:pPr>
-      <w:r>
-        <w:rPr>
-          <w:color w:val="506E8C"/>
-          <w:sz w:val="19"/>
-        </w:rPr>
-        <w:t>【图：一架玩具飞机。旁边文字：原价：每架 140 元；优惠价：每架 108 元。】</w:t>
-      </w:r>
     </w:p>
     <w:p>
       <w:pPr>
-        <w:spacing w:after="80" w:line="300" w:lineRule="auto"/>
+        <w:spacing w:line="317" w:lineRule="auto"/>
         <w:rPr>
           <w:rFonts w:hint="eastAsia"/>
         </w:rPr>
       </w:pPr>
       <w:r>
-        <w:t>11. 下面是王欢家到学校的路线图。</w:t>
+        <w:t>9. 已知 △×☆=360，如果 △ 不变，☆ 扩大到原来的 5 倍，那么积变为（________）。</w:t>
       </w:r>
     </w:p>
     <w:p>
       <w:pPr>
-        <w:spacing w:after="80" w:line="300" w:lineRule="auto"/>
+        <w:spacing w:after="480" w:line="240" w:lineRule="auto"/>
         <w:rPr>
           <w:rFonts w:hint="eastAsia"/>
         </w:rPr>
       </w:pPr>
-      <w:r>
-        <w:rPr>
-          <w:color w:val="506E8C"/>
-          <w:sz w:val="19"/>
-        </w:rPr>
-        <w:t>【图：折线路线图。超市在最高点，学校在左下方，王欢家在右下方，两段路上都画有小刻度。超市右侧另有向上的指北箭头，箭头下有比例尺“200米”。折线在超市处形成一个角。】</w:t>
-      </w:r>
     </w:p>
     <w:p>
       <w:pPr>
-        <w:spacing w:after="60" w:line="300" w:lineRule="auto"/>
+        <w:spacing w:line="317" w:lineRule="auto"/>
         <w:rPr>
           <w:rFonts w:hint="eastAsia"/>
         </w:rPr>
       </w:pPr>
       <w:r>
-        <w:t>王欢家到学校的路线图正好形成了一个（　　）角，用量角器可以量出这个角是（　　）°。</w:t>
+        <w:t>10. 某玩具店批发了 70 架玩具飞机，每架玩具飞机的进价是 118 元，这个玩具店在卖出 45 架后，开始以优惠价（如图）出售，剩下的玩具飞机全部卖出后，玩具店（________）（填“赚”或“赔”）钱了。</w:t>
       </w:r>
     </w:p>
     <w:p>
       <w:pPr>
-        <w:spacing w:after="60" w:line="300" w:lineRule="auto"/>
+        <w:spacing w:after="40" w:line="264" w:lineRule="auto"/>
         <w:rPr>
           <w:rFonts w:hint="eastAsia"/>
         </w:rPr>
       </w:pPr>
       <w:r>
-        <w:t>二、选择题。（每题 2 分，共 10 分）</w:t>
+        <w:rPr>
+          <w:color w:val="506E8C"/>
+          <w:sz w:val="18"/>
+        </w:rPr>
+        <w:t>【图：一架玩具飞机。旁边文字：原价：每架 140 元；优惠价：每架 108 元。】</w:t>
       </w:r>
     </w:p>
     <w:p>
       <w:pPr>
-        <w:spacing w:after="80" w:line="300" w:lineRule="auto"/>
+        <w:spacing w:after="480" w:line="240" w:lineRule="auto"/>
         <w:rPr>
           <w:rFonts w:hint="eastAsia"/>
         </w:rPr>
       </w:pPr>
-      <w:r>
-        <w:t>1. 添“0”问题：在数字 9 和 2 中间添（　　）个 0，就是九百万零二。</w:t>
-      </w:r>
     </w:p>
     <w:p>
       <w:pPr>
-        <w:spacing w:after="60" w:line="300" w:lineRule="auto"/>
+        <w:spacing w:line="317" w:lineRule="auto"/>
         <w:rPr>
           <w:rFonts w:hint="eastAsia"/>
         </w:rPr>
       </w:pPr>
       <w:r>
-        <w:t>A. 5　　B. 6　　C. 7</w:t>
+        <w:t>11. 下面是王欢家到学校的路线图。</w:t>
       </w:r>
     </w:p>
     <w:p>
       <w:pPr>
-        <w:spacing w:after="80" w:line="300" w:lineRule="auto"/>
+        <w:spacing w:after="40" w:line="264" w:lineRule="auto"/>
         <w:rPr>
           <w:rFonts w:hint="eastAsia"/>
         </w:rPr>
       </w:pPr>
       <w:r>
-        <w:t>2. 如果 ☆×◇=405，那么 (☆× 5)×◇ 的结果是（　　）。</w:t>
+        <w:rPr>
+          <w:color w:val="506E8C"/>
+          <w:sz w:val="18"/>
+        </w:rPr>
+        <w:t>【图：折线路线图。超市在最高点，学校在左下方，王欢家在右下方，两段路上都画有小刻度。超市右侧另有向上的指北箭头，箭头下有比例尺“200米”。折线在超市处形成一个角。】</w:t>
       </w:r>
     </w:p>
     <w:p>
       <w:pPr>
-        <w:spacing w:after="60" w:line="300" w:lineRule="auto"/>
+        <w:spacing w:after="160" w:line="317" w:lineRule="auto"/>
         <w:rPr>
           <w:rFonts w:hint="eastAsia"/>
         </w:rPr>
       </w:pPr>
       <w:r>
-        <w:t>A. 81　　B. 1620　　C. 2025</w:t>
+        <w:t>王欢家到学校的路线图正好形成了一个（________）角，用量角器可以量出这个角是（________）°。</w:t>
       </w:r>
     </w:p>
     <w:p>
       <w:pPr>
-        <w:spacing w:after="80" w:line="300" w:lineRule="auto"/>
+        <w:spacing w:after="480" w:line="240" w:lineRule="auto"/>
         <w:rPr>
           <w:rFonts w:hint="eastAsia"/>
         </w:rPr>
       </w:pPr>
-      <w:r>
-        <w:t>3. 丁丁在折纸，图（　　）没有折出 45° 的角。</w:t>
-      </w:r>
     </w:p>
     <w:p>
       <w:pPr>
-        <w:spacing w:after="60" w:line="300" w:lineRule="auto"/>
+        <w:spacing w:before="160" w:after="60" w:line="317" w:lineRule="auto"/>
         <w:rPr>
           <w:rFonts w:hint="eastAsia"/>
         </w:rPr>
       </w:pPr>
       <w:r>
-        <w:t>A. 【图：正方形，两条对角线以及过中心的横线、竖线，分成 8 个小三角形。】</w:t>
+        <w:rPr>
+          <w:rFonts w:ascii="黑体" w:eastAsia="黑体" w:hAnsi="黑体"/>
+          <w:b/>
+          <w:sz w:val="22"/>
+        </w:rPr>
+        <w:t>二、选择题。（每题 2 分，共 10 分）</w:t>
       </w:r>
     </w:p>
     <w:p>
       <w:pPr>
-        <w:spacing w:after="60" w:line="300" w:lineRule="auto"/>
+        <w:spacing w:line="317" w:lineRule="auto"/>
         <w:rPr>
           <w:rFonts w:hint="eastAsia"/>
         </w:rPr>
       </w:pPr>
       <w:r>
-        <w:t>B. 【图：正六边形，中心与六个顶点相连，分成 6 个三角形。】</w:t>
+        <w:t>1. 添“0”问题：在数字 9 和 2 中间添（________）个 0，就是九百万零二。</w:t>
       </w:r>
     </w:p>
     <w:p>
       <w:pPr>
-        <w:spacing w:after="60" w:line="300" w:lineRule="auto"/>
+        <w:spacing w:after="160" w:line="317" w:lineRule="auto"/>
         <w:rPr>
           <w:rFonts w:hint="eastAsia"/>
         </w:rPr>
       </w:pPr>
       <w:r>
-        <w:t>C. 【图：圆，过圆心有横、竖两条直径和两条斜直径，分成 8 份。】</w:t>
+        <w:t>A. 5　　B. 6　　C. 7</w:t>
       </w:r>
     </w:p>
     <w:p>
       <w:pPr>
-        <w:spacing w:after="80" w:line="300" w:lineRule="auto"/>
+        <w:spacing w:line="317" w:lineRule="auto"/>
         <w:rPr>
           <w:rFonts w:hint="eastAsia"/>
         </w:rPr>
       </w:pPr>
       <w:r>
-        <w:t>4. 一个量角器被磨损得大多数刻度已经看不清了，只留下 20°、40°、80°、120° 这 4 条刻度线（均为内圈刻度），用这个量角器可以一次性画出（　　）种大小不等的角。</w:t>
+        <w:t>2. 如果 ☆×◇=405，那么 (☆× 5)×◇ 的结果是（________）。</w:t>
       </w:r>
     </w:p>
     <w:p>
       <w:pPr>
-        <w:spacing w:after="60" w:line="300" w:lineRule="auto"/>
+        <w:spacing w:after="160" w:line="317" w:lineRule="auto"/>
         <w:rPr>
           <w:rFonts w:hint="eastAsia"/>
         </w:rPr>
       </w:pPr>
       <w:r>
-        <w:t>A. 5　　B. 6　　C. 7</w:t>
+        <w:t>A. 81　　B. 1620　　C. 2025</w:t>
       </w:r>
     </w:p>
     <w:p>
       <w:pPr>
-        <w:spacing w:before="160" w:after="0" w:line="300" w:lineRule="auto"/>
+        <w:spacing w:line="317" w:lineRule="auto"/>
+        <w:rPr>
+          <w:rFonts w:hint="eastAsia"/>
+        </w:rPr>
+      </w:pPr>
+      <w:r>
+        <w:t>3. 丁丁在折纸，图（________）没有折出 45° 的角。</w:t>
+      </w:r>
+    </w:p>
+    <w:p>
+      <w:pPr>
+        <w:spacing w:after="160" w:line="317" w:lineRule="auto"/>
+        <w:rPr>
+          <w:rFonts w:hint="eastAsia"/>
+        </w:rPr>
+      </w:pPr>
+      <w:r>
+        <w:t>A. 【图：正方形，两条对角线以及过中心的横线、竖线，分成 8 个小三角形。】</w:t>
+      </w:r>
+    </w:p>
+    <w:p>
+      <w:pPr>
+        <w:spacing w:after="160" w:line="317" w:lineRule="auto"/>
+        <w:rPr>
+          <w:rFonts w:hint="eastAsia"/>
+        </w:rPr>
+      </w:pPr>
+      <w:r>
+        <w:t>B. 【图：正六边形，中心与六个顶点相连，分成 6 个三角形。】</w:t>
+      </w:r>
+    </w:p>
+    <w:p>
+      <w:pPr>
+        <w:spacing w:after="160" w:line="317" w:lineRule="auto"/>
+        <w:rPr>
+          <w:rFonts w:hint="eastAsia"/>
+        </w:rPr>
+      </w:pPr>
+      <w:r>
+        <w:t>C. 【图：圆，过圆心有横、竖两条直径和两条斜直径，分成 8 份。】</w:t>
+      </w:r>
+    </w:p>
+    <w:p>
+      <w:pPr>
+        <w:spacing w:line="317" w:lineRule="auto"/>
+        <w:rPr>
+          <w:rFonts w:hint="eastAsia"/>
+        </w:rPr>
+      </w:pPr>
+      <w:r>
+        <w:t>4. 一个量角器被磨损得大多数刻度已经看不清了，只留下 20°、40°、80°、120° 这 4 条刻度线（均为内圈刻度），用这个量角器可以一次性画出（________）种大小不等的角。</w:t>
+      </w:r>
+    </w:p>
+    <w:p>
+      <w:pPr>
+        <w:spacing w:after="160" w:line="317" w:lineRule="auto"/>
+        <w:rPr>
+          <w:rFonts w:hint="eastAsia"/>
+        </w:rPr>
+      </w:pPr>
+      <w:r>
+        <w:t>A. 5　　B. 6　　C. 7</w:t>
+      </w:r>
+    </w:p>
+    <w:p>
+      <w:pPr>
+        <w:spacing w:before="120" w:after="0"/>
         <w:jc w:val="center"/>
         <w:rPr>
           <w:rFonts w:hint="eastAsia"/>
@@ -1120,7 +1295,7 @@
     </w:p>
     <w:p>
       <w:pPr>
-        <w:spacing w:after="80" w:line="300" w:lineRule="auto"/>
+        <w:spacing w:after="80" w:line="307" w:lineRule="auto"/>
         <w:rPr>
           <w:rFonts w:hint="eastAsia"/>
         </w:rPr>
@@ -1131,18 +1306,18 @@
     </w:p>
     <w:p>
       <w:pPr>
-        <w:spacing w:after="80" w:line="300" w:lineRule="auto"/>
+        <w:spacing w:after="120" w:line="307" w:lineRule="auto"/>
         <w:rPr>
           <w:rFonts w:hint="eastAsia"/>
         </w:rPr>
       </w:pPr>
       <w:r>
-        <w:t>5. 2026 年是中国工农红军长征胜利 90 周年。广西某小学的老师带着 110 人一起去湘江战役纪念馆开展红色研学活动。已知车票每张 36 元（老师免费），他们应该准备多少钱买车票？下面估算方法合理的是（　　）。</w:t>
+        <w:t>5. 2026 年是中国工农红军长征胜利 90 周年。广西某小学的老师带着 110 人一起去湘江战役纪念馆开展红色研学活动。已知车票每张 36 元（老师免费），他们应该准备多少钱买车票？下面估算方法合理的是（________）。</w:t>
       </w:r>
     </w:p>
     <w:p>
       <w:pPr>
-        <w:spacing w:after="60" w:line="300" w:lineRule="auto"/>
+        <w:spacing w:after="80" w:line="307" w:lineRule="auto"/>
         <w:rPr>
           <w:rFonts w:hint="eastAsia"/>
         </w:rPr>
@@ -1153,7 +1328,7 @@
     </w:p>
     <w:p>
       <w:pPr>
-        <w:spacing w:after="60" w:line="300" w:lineRule="auto"/>
+        <w:spacing w:after="80" w:line="307" w:lineRule="auto"/>
         <w:rPr>
           <w:rFonts w:hint="eastAsia"/>
         </w:rPr>
@@ -1164,7 +1339,7 @@
     </w:p>
     <w:p>
       <w:pPr>
-        <w:spacing w:after="60" w:line="300" w:lineRule="auto"/>
+        <w:spacing w:after="80" w:line="307" w:lineRule="auto"/>
         <w:rPr>
           <w:rFonts w:hint="eastAsia"/>
         </w:rPr>
@@ -1175,143 +1350,231 @@
     </w:p>
     <w:p>
       <w:pPr>
-        <w:spacing w:after="60" w:line="300" w:lineRule="auto"/>
+        <w:spacing w:after="320" w:line="240" w:lineRule="auto"/>
         <w:rPr>
           <w:rFonts w:hint="eastAsia"/>
         </w:rPr>
       </w:pPr>
-      <w:r>
-        <w:t>三、计算题。（22 分）</w:t>
-      </w:r>
     </w:p>
     <w:p>
       <w:pPr>
-        <w:spacing w:after="80" w:line="300" w:lineRule="auto"/>
+        <w:spacing w:before="120" w:after="60" w:line="307" w:lineRule="auto"/>
         <w:rPr>
           <w:rFonts w:hint="eastAsia"/>
         </w:rPr>
       </w:pPr>
       <w:r>
-        <w:t>1. 直接写出得数。（8 分）</w:t>
+        <w:rPr>
+          <w:rFonts w:ascii="黑体" w:eastAsia="黑体" w:hAnsi="黑体"/>
+          <w:b/>
+          <w:sz w:val="22"/>
+        </w:rPr>
+        <w:t>三、计算题。（22 分）</w:t>
       </w:r>
     </w:p>
     <w:p>
       <w:pPr>
-        <w:spacing w:after="60" w:line="300" w:lineRule="auto"/>
+        <w:spacing w:after="120" w:line="307" w:lineRule="auto"/>
         <w:rPr>
           <w:rFonts w:hint="eastAsia"/>
         </w:rPr>
       </w:pPr>
       <w:r>
-        <w:t>125× 8=　　90× 80=　　32× 49=　　25× 40=</w:t>
+        <w:t>1. 直接写出得数。（8 分）</w:t>
       </w:r>
     </w:p>
     <w:p>
       <w:pPr>
-        <w:spacing w:after="60" w:line="300" w:lineRule="auto"/>
+        <w:spacing w:after="80" w:line="307" w:lineRule="auto"/>
         <w:rPr>
           <w:rFonts w:hint="eastAsia"/>
         </w:rPr>
       </w:pPr>
       <w:r>
-        <w:t>180× 4=　　120× 50=　　500× 60=　　201× 30=</w:t>
+        <w:t>125× 8= ______　　90× 80= ______　　32× 49= ______　　25× 40= ______</w:t>
       </w:r>
     </w:p>
     <w:p>
       <w:pPr>
-        <w:spacing w:after="80" w:line="300" w:lineRule="auto"/>
+        <w:spacing w:after="80" w:line="307" w:lineRule="auto"/>
         <w:rPr>
           <w:rFonts w:hint="eastAsia"/>
         </w:rPr>
       </w:pPr>
       <w:r>
-        <w:t>2. 列竖式计算，带  的要验算。（14 分）</w:t>
+        <w:t>180× 4= ______　　120× 50= ______　　500× 60= ______　　201× 30= ______</w:t>
       </w:r>
     </w:p>
     <w:p>
       <w:pPr>
-        <w:spacing w:after="60" w:line="300" w:lineRule="auto"/>
+        <w:spacing w:after="320" w:line="240" w:lineRule="auto"/>
         <w:rPr>
           <w:rFonts w:hint="eastAsia"/>
         </w:rPr>
       </w:pPr>
-      <w:r>
-        <w:t>26× 48=　　307× 23=　　560× 12=　　324× 25=</w:t>
-      </w:r>
     </w:p>
     <w:p>
       <w:pPr>
-        <w:spacing w:after="60" w:line="300" w:lineRule="auto"/>
+        <w:spacing w:after="120" w:line="307" w:lineRule="auto"/>
         <w:rPr>
           <w:rFonts w:hint="eastAsia"/>
         </w:rPr>
       </w:pPr>
       <w:r>
-        <w:t>四、按要求做一做。（8 分）</w:t>
+        <w:t>2. 列竖式计算，带  的要验算。（14 分）</w:t>
       </w:r>
     </w:p>
     <w:p>
       <w:pPr>
-        <w:spacing w:after="80" w:line="300" w:lineRule="auto"/>
+        <w:spacing w:after="80" w:line="307" w:lineRule="auto"/>
         <w:rPr>
           <w:rFonts w:hint="eastAsia"/>
         </w:rPr>
       </w:pPr>
       <w:r>
-        <w:t>1. 以射线 AB 为一条边画一个 60° 的角。（4 分）</w:t>
+        <w:t>26× 48= ______　　307× 23= ______　　560× 12= ______　　324× 25= ______</w:t>
       </w:r>
     </w:p>
     <w:p>
       <w:pPr>
-        <w:spacing w:after="80" w:line="300" w:lineRule="auto"/>
+        <w:spacing w:after="320" w:line="240" w:lineRule="auto"/>
         <w:rPr>
           <w:rFonts w:hint="eastAsia"/>
         </w:rPr>
       </w:pPr>
-      <w:r>
-        <w:rPr>
-          <w:color w:val="506E8C"/>
-          <w:sz w:val="19"/>
-        </w:rPr>
-        <w:t>【图：一条水平射线，箭头朝右。左端上方标 A，靠右端上方标 B。】</w:t>
-      </w:r>
     </w:p>
     <w:p>
       <w:pPr>
-        <w:spacing w:after="80" w:line="300" w:lineRule="auto"/>
+        <w:spacing w:before="120" w:after="60" w:line="307" w:lineRule="auto"/>
         <w:rPr>
           <w:rFonts w:hint="eastAsia"/>
         </w:rPr>
       </w:pPr>
       <w:r>
-        <w:t>2. 画一个比直角大 15° 的角。（4 分）</w:t>
+        <w:rPr>
+          <w:rFonts w:ascii="黑体" w:eastAsia="黑体" w:hAnsi="黑体"/>
+          <w:b/>
+          <w:sz w:val="22"/>
+        </w:rPr>
+        <w:t>四、按要求做一做。（8 分）</w:t>
       </w:r>
     </w:p>
     <w:p>
       <w:pPr>
-        <w:spacing w:after="60" w:line="300" w:lineRule="auto"/>
+        <w:spacing w:after="120" w:line="307" w:lineRule="auto"/>
         <w:rPr>
           <w:rFonts w:hint="eastAsia"/>
         </w:rPr>
       </w:pPr>
       <w:r>
-        <w:t>五、解决问题。（33 分）</w:t>
+        <w:t>1. 以射线 AB 为一条边画一个 60° 的角。（4 分）</w:t>
       </w:r>
     </w:p>
     <w:p>
       <w:pPr>
-        <w:spacing w:after="80" w:line="300" w:lineRule="auto"/>
+        <w:spacing w:after="40" w:line="264" w:lineRule="auto"/>
         <w:rPr>
           <w:rFonts w:hint="eastAsia"/>
         </w:rPr>
       </w:pPr>
       <w:r>
-        <w:t>1. 北京雁栖湖环湖路线全长约 13 千米，奇奇每分钟骑行 215 米，1 小时能骑行完一圈吗？若不能，还剩多少米？（5 分）</w:t>
+        <w:rPr>
+          <w:color w:val="506E8C"/>
+          <w:sz w:val="18"/>
+        </w:rPr>
+        <w:t>【图：一条水平射线，箭头朝右。左端上方标 A，靠右端上方标 B。】</w:t>
       </w:r>
     </w:p>
     <w:p>
       <w:pPr>
-        <w:spacing w:before="160" w:after="0" w:line="300" w:lineRule="auto"/>
+        <w:spacing w:after="1280" w:line="240" w:lineRule="auto"/>
+        <w:rPr>
+          <w:rFonts w:hint="eastAsia"/>
+        </w:rPr>
+      </w:pPr>
+    </w:p>
+    <w:p>
+      <w:pPr>
+        <w:spacing w:after="120" w:line="307" w:lineRule="auto"/>
+        <w:rPr>
+          <w:rFonts w:hint="eastAsia"/>
+        </w:rPr>
+      </w:pPr>
+      <w:r>
+        <w:t>2. 画一个比直角大 15° 的角。（4 分）</w:t>
+      </w:r>
+    </w:p>
+    <w:p>
+      <w:pPr>
+        <w:spacing w:after="1280" w:line="240" w:lineRule="auto"/>
+        <w:rPr>
+          <w:rFonts w:hint="eastAsia"/>
+        </w:rPr>
+      </w:pPr>
+    </w:p>
+    <w:p>
+      <w:pPr>
+        <w:spacing w:before="120" w:after="60" w:line="307" w:lineRule="auto"/>
+        <w:rPr>
+          <w:rFonts w:hint="eastAsia"/>
+        </w:rPr>
+      </w:pPr>
+      <w:r>
+        <w:rPr>
+          <w:rFonts w:ascii="黑体" w:eastAsia="黑体" w:hAnsi="黑体"/>
+          <w:b/>
+          <w:sz w:val="22"/>
+        </w:rPr>
+        <w:t>五、解决问题。（33 分）</w:t>
+      </w:r>
+    </w:p>
+    <w:p>
+      <w:pPr>
+        <w:spacing w:after="120" w:line="307" w:lineRule="auto"/>
+        <w:rPr>
+          <w:rFonts w:hint="eastAsia"/>
+        </w:rPr>
+      </w:pPr>
+      <w:r>
+        <w:t>1. 北京雁栖湖环湖路线全长约 13 千米，奇奇每分钟骑行 215 米，1 小时能骑行完一圈吗？若不能，还剩多少米？（5 分）</w:t>
+      </w:r>
+    </w:p>
+    <w:p>
+      <w:pPr>
+        <w:spacing w:after="160" w:line="324" w:lineRule="auto"/>
+        <w:rPr>
+          <w:rFonts w:hint="eastAsia"/>
+        </w:rPr>
+      </w:pPr>
+      <w:r>
+        <w:t xml:space="preserve">　　________________________________________________</w:t>
+      </w:r>
+    </w:p>
+    <w:p>
+      <w:pPr>
+        <w:spacing w:after="160" w:line="324" w:lineRule="auto"/>
+        <w:rPr>
+          <w:rFonts w:hint="eastAsia"/>
+        </w:rPr>
+      </w:pPr>
+      <w:r>
+        <w:t xml:space="preserve">　　________________________________________________</w:t>
+      </w:r>
+    </w:p>
+    <w:p>
+      <w:pPr>
+        <w:spacing w:after="160" w:line="324" w:lineRule="auto"/>
+        <w:rPr>
+          <w:rFonts w:hint="eastAsia"/>
+        </w:rPr>
+      </w:pPr>
+      <w:r>
+        <w:t xml:space="preserve">　　________________________________________________</w:t>
+      </w:r>
+    </w:p>
+    <w:p>
+      <w:pPr>
+        <w:spacing w:before="120" w:after="0"/>
         <w:jc w:val="center"/>
         <w:rPr>
           <w:rFonts w:hint="eastAsia"/>
@@ -1340,7 +1603,7 @@
     </w:p>
     <w:p>
       <w:pPr>
-        <w:spacing w:after="80" w:line="300" w:lineRule="auto"/>
+        <w:spacing w:after="120" w:line="307" w:lineRule="auto"/>
         <w:rPr>
           <w:rFonts w:hint="eastAsia"/>
         </w:rPr>
@@ -1351,150 +1614,129 @@
     </w:p>
     <w:p>
       <w:pPr>
-        <w:spacing w:after="80" w:line="300" w:lineRule="auto"/>
+        <w:spacing w:after="320" w:line="240" w:lineRule="auto"/>
         <w:rPr>
           <w:rFonts w:hint="eastAsia"/>
         </w:rPr>
       </w:pPr>
-      <w:r>
-        <w:t>（1）一摞有 13 个平盘，40 摞共有多少个平盘？（5 分）</w:t>
-      </w:r>
     </w:p>
     <w:p>
       <w:pPr>
-        <w:spacing w:after="80" w:line="300" w:lineRule="auto"/>
+        <w:spacing w:after="120" w:line="307" w:lineRule="auto"/>
         <w:rPr>
           <w:rFonts w:hint="eastAsia"/>
         </w:rPr>
       </w:pPr>
       <w:r>
-        <w:rPr>
-          <w:color w:val="506E8C"/>
-          <w:sz w:val="19"/>
-        </w:rPr>
-        <w:t>【图：并排三摞平盘，右边有省略号，表示后面还有很多摞。】</w:t>
+        <w:t>（1）一摞有 13 个平盘，40 摞共有多少个平盘？（5 分）</w:t>
       </w:r>
     </w:p>
     <w:p>
       <w:pPr>
-        <w:spacing w:after="80" w:line="300" w:lineRule="auto"/>
+        <w:spacing w:after="40" w:line="264" w:lineRule="auto"/>
         <w:rPr>
           <w:rFonts w:hint="eastAsia"/>
         </w:rPr>
       </w:pPr>
       <w:r>
-        <w:t>（2）1 个平盘 6 元，40 摞平盘可以卖多少钱？（5 分）</w:t>
+        <w:rPr>
+          <w:color w:val="506E8C"/>
+          <w:sz w:val="18"/>
+        </w:rPr>
+        <w:t>【图：并排三摞平盘，右边有省略号，表示后面还有很多摞。】</w:t>
       </w:r>
     </w:p>
     <w:p>
       <w:pPr>
-        <w:spacing w:after="80" w:line="300" w:lineRule="auto"/>
+        <w:spacing w:after="160" w:line="324" w:lineRule="auto"/>
         <w:rPr>
           <w:rFonts w:hint="eastAsia"/>
         </w:rPr>
       </w:pPr>
       <w:r>
-        <w:t>3. 厨房的一款折叠推拉门合拢后的示意图如下，当全部拉开后，宽增加了 12 分米，那么全部拉开后整个门的面积是多少？（重叠部分忽略不计）（5 分）</w:t>
+        <w:t xml:space="preserve">　　________________________________________________</w:t>
       </w:r>
     </w:p>
     <w:p>
       <w:pPr>
-        <w:spacing w:after="80" w:line="300" w:lineRule="auto"/>
+        <w:spacing w:after="160" w:line="324" w:lineRule="auto"/>
         <w:rPr>
           <w:rFonts w:hint="eastAsia"/>
         </w:rPr>
       </w:pPr>
       <w:r>
-        <w:rPr>
-          <w:color w:val="506E8C"/>
-          <w:sz w:val="19"/>
-        </w:rPr>
-        <w:t>【图：一个竖着的长方形门。长方形内写着“144平方分米”，底边下方标着“6分米”。】</w:t>
+        <w:t xml:space="preserve">　　________________________________________________</w:t>
       </w:r>
     </w:p>
     <w:p>
       <w:pPr>
-        <w:spacing w:after="80" w:line="300" w:lineRule="auto"/>
+        <w:spacing w:after="160" w:line="324" w:lineRule="auto"/>
         <w:rPr>
           <w:rFonts w:hint="eastAsia"/>
         </w:rPr>
       </w:pPr>
       <w:r>
-        <w:t>4. 炒锅是常见的烹饪器具，主要适用于煎、炒、蒸、炖等多种烹饪方式。下面是乐乐统计的周末两天卖出的 3 款炒锅的数量。店里卖这 3 款炒锅一共收入多少钱？（6 分）</w:t>
+        <w:t xml:space="preserve">　　________________________________________________</w:t>
       </w:r>
     </w:p>
     <w:p>
       <w:pPr>
-        <w:spacing w:after="40" w:line="300" w:lineRule="auto"/>
+        <w:spacing w:after="120" w:line="307" w:lineRule="auto"/>
         <w:rPr>
           <w:rFonts w:hint="eastAsia"/>
         </w:rPr>
       </w:pPr>
       <w:r>
-        <w:rPr>
-          <w:sz w:val="20"/>
-        </w:rPr>
-        <w:t>款式　A 款　B 款　C 款</w:t>
+        <w:t>（2）1 个平盘 6 元，40 摞平盘可以卖多少钱？（5 分）</w:t>
       </w:r>
     </w:p>
     <w:p>
       <w:pPr>
-        <w:spacing w:after="40" w:line="300" w:lineRule="auto"/>
+        <w:spacing w:after="160" w:line="324" w:lineRule="auto"/>
         <w:rPr>
           <w:rFonts w:hint="eastAsia"/>
         </w:rPr>
       </w:pPr>
       <w:r>
-        <w:rPr>
-          <w:sz w:val="20"/>
-        </w:rPr>
-        <w:t>售出数量/个　13　14　17</w:t>
+        <w:t xml:space="preserve">　　________________________________________________</w:t>
       </w:r>
     </w:p>
     <w:p>
       <w:pPr>
-        <w:spacing w:after="40" w:line="300" w:lineRule="auto"/>
+        <w:spacing w:after="160" w:line="324" w:lineRule="auto"/>
         <w:rPr>
           <w:rFonts w:hint="eastAsia"/>
         </w:rPr>
       </w:pPr>
       <w:r>
-        <w:rPr>
-          <w:sz w:val="20"/>
-        </w:rPr>
-        <w:t>每个价格/元　140　165　206</w:t>
+        <w:t xml:space="preserve">　　________________________________________________</w:t>
       </w:r>
     </w:p>
     <w:p>
       <w:pPr>
-        <w:spacing w:after="80" w:line="300" w:lineRule="auto"/>
+        <w:spacing w:after="160" w:line="324" w:lineRule="auto"/>
         <w:rPr>
           <w:rFonts w:hint="eastAsia"/>
         </w:rPr>
       </w:pPr>
       <w:r>
-        <w:t>5. 南宋朱熹取《礼记》之《大学》《中庸》篇，分章注释，与《论语》《孟子》合为“四书”。实验小学在美文诵读比赛中，有 42 名同学获得优秀奖，校长准备花 5000 元为这些获奖同学买同样的书作为奖品，每人一套。你认为校长应该选购哪套图书（使剩余的钱尽量少）？买这些奖品一共要花多少元？（7 分）</w:t>
+        <w:t xml:space="preserve">　　________________________________________________</w:t>
       </w:r>
     </w:p>
     <w:p>
       <w:pPr>
-        <w:spacing w:after="80" w:line="300" w:lineRule="auto"/>
+        <w:spacing w:after="120" w:line="307" w:lineRule="auto"/>
         <w:rPr>
           <w:rFonts w:hint="eastAsia"/>
         </w:rPr>
       </w:pPr>
       <w:r>
-        <w:rPr>
-          <w:color w:val="506E8C"/>
-          <w:sz w:val="19"/>
-        </w:rPr>
-        <w:t>【图：三本书并排。从左到右封面为《孟子》《论语》《大学》，书下价格依次为 158元/套、109元/套、118元/套。】</w:t>
+        <w:t>3. 厨房的一款折叠推拉门合拢后的示意图如下，当全部拉开后，宽增加了 12 分米，那么全部拉开后整个门的面积是多少？（重叠部分忽略不计）（5 分）</w:t>
       </w:r>
     </w:p>
     <w:p>
       <w:pPr>
-        <w:spacing w:before="160" w:after="0" w:line="300" w:lineRule="auto"/>
-        <w:jc w:val="center"/>
+        <w:spacing w:after="40" w:line="264" w:lineRule="auto"/>
         <w:rPr>
           <w:rFonts w:hint="eastAsia"/>
         </w:rPr>
@@ -1504,12 +1746,206 @@
           <w:color w:val="506E8C"/>
           <w:sz w:val="18"/>
         </w:rPr>
-        <w:t>数学 · 四上 · 期中练习　第 4 页（共 4 页）</w:t>
+        <w:t>【图：一个竖着的长方形门。长方形内写着“144平方分米”，底边下方标着“6分米”。】</w:t>
       </w:r>
     </w:p>
     <w:p>
       <w:pPr>
-        <w:spacing w:before="160" w:after="0" w:line="300" w:lineRule="auto"/>
+        <w:spacing w:after="160" w:line="324" w:lineRule="auto"/>
+        <w:rPr>
+          <w:rFonts w:hint="eastAsia"/>
+        </w:rPr>
+      </w:pPr>
+      <w:r>
+        <w:t xml:space="preserve">　　________________________________________________</w:t>
+      </w:r>
+    </w:p>
+    <w:p>
+      <w:pPr>
+        <w:spacing w:after="160" w:line="324" w:lineRule="auto"/>
+        <w:rPr>
+          <w:rFonts w:hint="eastAsia"/>
+        </w:rPr>
+      </w:pPr>
+      <w:r>
+        <w:t xml:space="preserve">　　________________________________________________</w:t>
+      </w:r>
+    </w:p>
+    <w:p>
+      <w:pPr>
+        <w:spacing w:after="160" w:line="324" w:lineRule="auto"/>
+        <w:rPr>
+          <w:rFonts w:hint="eastAsia"/>
+        </w:rPr>
+      </w:pPr>
+      <w:r>
+        <w:t xml:space="preserve">　　________________________________________________</w:t>
+      </w:r>
+    </w:p>
+    <w:p>
+      <w:pPr>
+        <w:spacing w:after="120" w:line="307" w:lineRule="auto"/>
+        <w:rPr>
+          <w:rFonts w:hint="eastAsia"/>
+        </w:rPr>
+      </w:pPr>
+      <w:r>
+        <w:t>4. 炒锅是常见的烹饪器具，主要适用于煎、炒、蒸、炖等多种烹饪方式。下面是乐乐统计的周末两天卖出的 3 款炒锅的数量。店里卖这 3 款炒锅一共收入多少钱？（6 分）</w:t>
+      </w:r>
+    </w:p>
+    <w:p>
+      <w:pPr>
+        <w:spacing w:after="40" w:line="307" w:lineRule="auto"/>
+        <w:rPr>
+          <w:rFonts w:hint="eastAsia"/>
+        </w:rPr>
+      </w:pPr>
+      <w:r>
+        <w:rPr>
+          <w:sz w:val="20"/>
+        </w:rPr>
+        <w:t>款式　A 款　B 款　C 款</w:t>
+      </w:r>
+    </w:p>
+    <w:p>
+      <w:pPr>
+        <w:spacing w:after="40" w:line="307" w:lineRule="auto"/>
+        <w:rPr>
+          <w:rFonts w:hint="eastAsia"/>
+        </w:rPr>
+      </w:pPr>
+      <w:r>
+        <w:rPr>
+          <w:sz w:val="20"/>
+        </w:rPr>
+        <w:t>售出数量/个　13　14　17</w:t>
+      </w:r>
+    </w:p>
+    <w:p>
+      <w:pPr>
+        <w:spacing w:after="40" w:line="307" w:lineRule="auto"/>
+        <w:rPr>
+          <w:rFonts w:hint="eastAsia"/>
+        </w:rPr>
+      </w:pPr>
+      <w:r>
+        <w:rPr>
+          <w:sz w:val="20"/>
+        </w:rPr>
+        <w:t>每个价格/元　140　165　206</w:t>
+      </w:r>
+    </w:p>
+    <w:p>
+      <w:pPr>
+        <w:spacing w:after="160" w:line="324" w:lineRule="auto"/>
+        <w:rPr>
+          <w:rFonts w:hint="eastAsia"/>
+        </w:rPr>
+      </w:pPr>
+      <w:r>
+        <w:t xml:space="preserve">　　________________________________________________</w:t>
+      </w:r>
+    </w:p>
+    <w:p>
+      <w:pPr>
+        <w:spacing w:after="160" w:line="324" w:lineRule="auto"/>
+        <w:rPr>
+          <w:rFonts w:hint="eastAsia"/>
+        </w:rPr>
+      </w:pPr>
+      <w:r>
+        <w:t xml:space="preserve">　　________________________________________________</w:t>
+      </w:r>
+    </w:p>
+    <w:p>
+      <w:pPr>
+        <w:spacing w:after="160" w:line="324" w:lineRule="auto"/>
+        <w:rPr>
+          <w:rFonts w:hint="eastAsia"/>
+        </w:rPr>
+      </w:pPr>
+      <w:r>
+        <w:t xml:space="preserve">　　________________________________________________</w:t>
+      </w:r>
+    </w:p>
+    <w:p>
+      <w:pPr>
+        <w:spacing w:after="120" w:line="307" w:lineRule="auto"/>
+        <w:rPr>
+          <w:rFonts w:hint="eastAsia"/>
+        </w:rPr>
+      </w:pPr>
+      <w:r>
+        <w:t>5. 南宋朱熹取《礼记》之《大学》《中庸》篇，分章注释，与《论语》《孟子》合为“四书”。实验小学在美文诵读比赛中，有 42 名同学获得优秀奖，校长准备花 5000 元为这些获奖同学买同样的书作为奖品，每人一套。你认为校长应该选购哪套图书（使剩余的钱尽量少）？买这些奖品一共要花多少元？（7 分）</w:t>
+      </w:r>
+    </w:p>
+    <w:p>
+      <w:pPr>
+        <w:spacing w:after="40" w:line="264" w:lineRule="auto"/>
+        <w:rPr>
+          <w:rFonts w:hint="eastAsia"/>
+        </w:rPr>
+      </w:pPr>
+      <w:r>
+        <w:rPr>
+          <w:color w:val="506E8C"/>
+          <w:sz w:val="18"/>
+        </w:rPr>
+        <w:t>【图：三本书并排。从左到右封面为《孟子》《论语》《大学》，书下价格依次为 158元/套、109元/套、118元/套。】</w:t>
+      </w:r>
+    </w:p>
+    <w:p>
+      <w:pPr>
+        <w:spacing w:after="160" w:line="324" w:lineRule="auto"/>
+        <w:rPr>
+          <w:rFonts w:hint="eastAsia"/>
+        </w:rPr>
+      </w:pPr>
+      <w:r>
+        <w:t xml:space="preserve">　　________________________________________________</w:t>
+      </w:r>
+    </w:p>
+    <w:p>
+      <w:pPr>
+        <w:spacing w:after="160" w:line="324" w:lineRule="auto"/>
+        <w:rPr>
+          <w:rFonts w:hint="eastAsia"/>
+        </w:rPr>
+      </w:pPr>
+      <w:r>
+        <w:t xml:space="preserve">　　________________________________________________</w:t>
+      </w:r>
+    </w:p>
+    <w:p>
+      <w:pPr>
+        <w:spacing w:after="160" w:line="324" w:lineRule="auto"/>
+        <w:rPr>
+          <w:rFonts w:hint="eastAsia"/>
+        </w:rPr>
+      </w:pPr>
+      <w:r>
+        <w:t xml:space="preserve">　　________________________________________________</w:t>
+      </w:r>
+    </w:p>
+    <w:p>
+      <w:pPr>
+        <w:spacing w:before="120" w:after="0"/>
+        <w:jc w:val="center"/>
+        <w:rPr>
+          <w:rFonts w:hint="eastAsia"/>
+        </w:rPr>
+      </w:pPr>
+      <w:r>
+        <w:rPr>
+          <w:color w:val="506E8C"/>
+          <w:sz w:val="18"/>
+        </w:rPr>
+        <w:t>数学 · 四上 · 期中练习　第 4 页（共 4 页）</w:t>
+      </w:r>
+    </w:p>
+    <w:p>
+      <w:pPr>
+        <w:spacing w:before="120" w:after="0"/>
         <w:jc w:val="center"/>
         <w:rPr>
           <w:rFonts w:hint="eastAsia"/>
@@ -1518,7 +1954,7 @@
     </w:p>
     <w:sectPr>
       <w:pgSz w:w="11906" w:h="16838"/>
-      <w:pgMar w:top="680" w:right="907" w:bottom="680" w:left="907" w:header="720" w:footer="720" w:gutter="0"/>
+      <w:pgMar w:top="624" w:right="850" w:bottom="624" w:left="850" w:header="720" w:footer="720" w:gutter="0"/>
       <w:cols w:space="720"/>
       <w:docGrid w:linePitch="360"/>
     </w:sectPr>
@@ -1761,31 +2197,31 @@
       </w:rPr>
     </w:lvl>
   </w:abstractNum>
-  <w:num w:numId="1" w16cid:durableId="1959143371">
+  <w:num w:numId="1" w16cid:durableId="1733457224">
     <w:abstractNumId w:val="8"/>
   </w:num>
-  <w:num w:numId="2" w16cid:durableId="825242799">
+  <w:num w:numId="2" w16cid:durableId="1397320822">
     <w:abstractNumId w:val="6"/>
   </w:num>
-  <w:num w:numId="3" w16cid:durableId="1110705448">
+  <w:num w:numId="3" w16cid:durableId="959413790">
     <w:abstractNumId w:val="5"/>
   </w:num>
-  <w:num w:numId="4" w16cid:durableId="2135709507">
+  <w:num w:numId="4" w16cid:durableId="954141052">
     <w:abstractNumId w:val="4"/>
   </w:num>
-  <w:num w:numId="5" w16cid:durableId="1272276430">
+  <w:num w:numId="5" w16cid:durableId="1694653793">
     <w:abstractNumId w:val="7"/>
   </w:num>
-  <w:num w:numId="6" w16cid:durableId="1653292745">
+  <w:num w:numId="6" w16cid:durableId="473613">
     <w:abstractNumId w:val="3"/>
   </w:num>
-  <w:num w:numId="7" w16cid:durableId="1614284051">
+  <w:num w:numId="7" w16cid:durableId="430054703">
     <w:abstractNumId w:val="2"/>
   </w:num>
-  <w:num w:numId="8" w16cid:durableId="932133047">
+  <w:num w:numId="8" w16cid:durableId="678194077">
     <w:abstractNumId w:val="1"/>
   </w:num>
-  <w:num w:numId="9" w16cid:durableId="995261163">
+  <w:num w:numId="9" w16cid:durableId="722212158">
     <w:abstractNumId w:val="0"/>
   </w:num>
 </w:numbering>

</xml_diff>

<commit_message>
Embed original midterm diagrams into A/D clear exams.
Crop figures from source photos and place them at matching question positions while keeping four pages.

Co-authored-by: Cursor <cursoragent@cursor.com>
</commit_message>
<xml_diff>
--- a/printables/midterm/A-期中综合练习卷/期中综合练习卷.docx
+++ b/printables/midterm/A-期中综合练习卷/期中综合练习卷.docx
@@ -4,7 +4,7 @@
   <w:body>
     <w:p>
       <w:pPr>
-        <w:spacing w:after="40" w:line="307" w:lineRule="auto"/>
+        <w:spacing w:after="40" w:line="288" w:lineRule="auto"/>
         <w:jc w:val="center"/>
         <w:rPr>
           <w:rFonts w:hint="eastAsia"/>
@@ -53,7 +53,7 @@
     </w:p>
     <w:p>
       <w:pPr>
-        <w:spacing w:after="40" w:line="307" w:lineRule="auto"/>
+        <w:spacing w:after="40" w:line="288" w:lineRule="auto"/>
         <w:jc w:val="center"/>
         <w:rPr>
           <w:rFonts w:hint="eastAsia"/>
@@ -111,7 +111,7 @@
     </w:p>
     <w:p>
       <w:pPr>
-        <w:spacing w:after="80" w:line="307" w:lineRule="auto"/>
+        <w:spacing w:after="80" w:line="288" w:lineRule="auto"/>
         <w:jc w:val="center"/>
         <w:rPr>
           <w:rFonts w:hint="eastAsia"/>
@@ -156,7 +156,7 @@
     </w:p>
     <w:p>
       <w:pPr>
-        <w:spacing w:after="80" w:line="307" w:lineRule="auto"/>
+        <w:spacing w:after="80" w:line="288" w:lineRule="auto"/>
         <w:rPr>
           <w:rFonts w:hint="eastAsia"/>
         </w:rPr>
@@ -213,7 +213,7 @@
     </w:p>
     <w:p>
       <w:pPr>
-        <w:spacing w:after="80" w:line="307" w:lineRule="auto"/>
+        <w:spacing w:after="40" w:line="288" w:lineRule="auto"/>
         <w:rPr>
           <w:rFonts w:hint="eastAsia"/>
         </w:rPr>
@@ -245,7 +245,7 @@
     </w:p>
     <w:p>
       <w:pPr>
-        <w:spacing w:after="80" w:line="307" w:lineRule="auto"/>
+        <w:spacing w:after="40" w:line="288" w:lineRule="auto"/>
         <w:rPr>
           <w:rFonts w:hint="eastAsia"/>
         </w:rPr>
@@ -256,7 +256,7 @@
     </w:p>
     <w:p>
       <w:pPr>
-        <w:spacing w:after="80" w:line="307" w:lineRule="auto"/>
+        <w:spacing w:after="40" w:line="288" w:lineRule="auto"/>
         <w:rPr>
           <w:rFonts w:hint="eastAsia"/>
         </w:rPr>
@@ -270,7 +270,7 @@
     </w:p>
     <w:p>
       <w:pPr>
-        <w:spacing w:after="80" w:line="307" w:lineRule="auto"/>
+        <w:spacing w:after="40" w:line="288" w:lineRule="auto"/>
         <w:rPr>
           <w:rFonts w:hint="eastAsia"/>
         </w:rPr>
@@ -281,7 +281,7 @@
     </w:p>
     <w:p>
       <w:pPr>
-        <w:spacing w:after="80" w:line="307" w:lineRule="auto"/>
+        <w:spacing w:after="40" w:line="288" w:lineRule="auto"/>
         <w:rPr>
           <w:rFonts w:hint="eastAsia"/>
         </w:rPr>
@@ -304,7 +304,7 @@
     </w:p>
     <w:p>
       <w:pPr>
-        <w:spacing w:after="40" w:line="307" w:lineRule="auto"/>
+        <w:spacing w:after="40" w:line="288" w:lineRule="auto"/>
         <w:rPr>
           <w:rFonts w:hint="eastAsia"/>
         </w:rPr>
@@ -318,7 +318,7 @@
     </w:p>
     <w:p>
       <w:pPr>
-        <w:spacing w:after="40" w:line="307" w:lineRule="auto"/>
+        <w:spacing w:after="40" w:line="288" w:lineRule="auto"/>
         <w:rPr>
           <w:rFonts w:hint="eastAsia"/>
         </w:rPr>
@@ -332,7 +332,7 @@
     </w:p>
     <w:p>
       <w:pPr>
-        <w:spacing w:before="120" w:after="60" w:line="307" w:lineRule="auto"/>
+        <w:spacing w:before="80" w:after="60" w:line="288" w:lineRule="auto"/>
         <w:rPr>
           <w:rFonts w:hint="eastAsia"/>
         </w:rPr>
@@ -380,7 +380,7 @@
     </w:p>
     <w:p>
       <w:pPr>
-        <w:spacing w:after="120" w:line="307" w:lineRule="auto"/>
+        <w:spacing w:after="80" w:line="288" w:lineRule="auto"/>
         <w:rPr>
           <w:rFonts w:hint="eastAsia"/>
         </w:rPr>
@@ -430,7 +430,7 @@
     </w:p>
     <w:p>
       <w:pPr>
-        <w:spacing w:after="320" w:line="240" w:lineRule="auto"/>
+        <w:spacing w:after="160" w:line="240" w:lineRule="auto"/>
         <w:rPr>
           <w:rFonts w:hint="eastAsia"/>
         </w:rPr>
@@ -438,7 +438,7 @@
     </w:p>
     <w:p>
       <w:pPr>
-        <w:spacing w:after="120" w:line="307" w:lineRule="auto"/>
+        <w:spacing w:after="80" w:line="288" w:lineRule="auto"/>
         <w:rPr>
           <w:rFonts w:hint="eastAsia"/>
         </w:rPr>
@@ -470,7 +470,7 @@
     </w:p>
     <w:p>
       <w:pPr>
-        <w:spacing w:after="80" w:line="307" w:lineRule="auto"/>
+        <w:spacing w:after="40" w:line="288" w:lineRule="auto"/>
         <w:rPr>
           <w:rFonts w:hint="eastAsia"/>
         </w:rPr>
@@ -493,7 +493,7 @@
     </w:p>
     <w:p>
       <w:pPr>
-        <w:spacing w:after="80" w:line="307" w:lineRule="auto"/>
+        <w:spacing w:after="40" w:line="288" w:lineRule="auto"/>
         <w:rPr>
           <w:rFonts w:hint="eastAsia"/>
         </w:rPr>
@@ -516,7 +516,7 @@
     </w:p>
     <w:p>
       <w:pPr>
-        <w:spacing w:after="320" w:line="240" w:lineRule="auto"/>
+        <w:spacing w:after="160" w:line="240" w:lineRule="auto"/>
         <w:rPr>
           <w:rFonts w:hint="eastAsia"/>
         </w:rPr>
@@ -524,7 +524,7 @@
     </w:p>
     <w:p>
       <w:pPr>
-        <w:spacing w:after="120" w:line="307" w:lineRule="auto"/>
+        <w:spacing w:after="80" w:line="288" w:lineRule="auto"/>
         <w:rPr>
           <w:rFonts w:hint="eastAsia"/>
         </w:rPr>
@@ -538,7 +538,7 @@
     </w:p>
     <w:p>
       <w:pPr>
-        <w:spacing w:after="80" w:line="307" w:lineRule="auto"/>
+        <w:spacing w:after="40" w:line="288" w:lineRule="auto"/>
         <w:rPr>
           <w:rFonts w:hint="eastAsia"/>
         </w:rPr>
@@ -573,7 +573,7 @@
     </w:p>
     <w:p>
       <w:pPr>
-        <w:spacing w:after="80" w:line="307" w:lineRule="auto"/>
+        <w:spacing w:after="40" w:line="288" w:lineRule="auto"/>
         <w:rPr>
           <w:rFonts w:hint="eastAsia"/>
         </w:rPr>
@@ -638,7 +638,7 @@
     </w:p>
     <w:p>
       <w:pPr>
-        <w:spacing w:after="320" w:line="240" w:lineRule="auto"/>
+        <w:spacing w:after="160" w:line="240" w:lineRule="auto"/>
         <w:rPr>
           <w:rFonts w:hint="eastAsia"/>
         </w:rPr>
@@ -646,7 +646,7 @@
     </w:p>
     <w:p>
       <w:pPr>
-        <w:spacing w:after="120" w:line="307" w:lineRule="auto"/>
+        <w:spacing w:after="80" w:line="288" w:lineRule="auto"/>
         <w:rPr>
           <w:rFonts w:hint="eastAsia"/>
         </w:rPr>
@@ -696,7 +696,7 @@
     </w:p>
     <w:p>
       <w:pPr>
-        <w:spacing w:after="320" w:line="240" w:lineRule="auto"/>
+        <w:spacing w:after="160" w:line="240" w:lineRule="auto"/>
         <w:rPr>
           <w:rFonts w:hint="eastAsia"/>
         </w:rPr>
@@ -704,7 +704,7 @@
     </w:p>
     <w:p>
       <w:pPr>
-        <w:spacing w:after="120" w:line="307" w:lineRule="auto"/>
+        <w:spacing w:after="80" w:line="288" w:lineRule="auto"/>
         <w:rPr>
           <w:rFonts w:hint="eastAsia"/>
         </w:rPr>
@@ -742,7 +742,7 @@
     </w:p>
     <w:p>
       <w:pPr>
-        <w:spacing w:after="320" w:line="240" w:lineRule="auto"/>
+        <w:spacing w:after="160" w:line="240" w:lineRule="auto"/>
         <w:rPr>
           <w:rFonts w:hint="eastAsia"/>
         </w:rPr>
@@ -750,7 +750,7 @@
     </w:p>
     <w:p>
       <w:pPr>
-        <w:spacing w:after="120" w:line="307" w:lineRule="auto"/>
+        <w:spacing w:after="80" w:line="288" w:lineRule="auto"/>
         <w:rPr>
           <w:rFonts w:hint="eastAsia"/>
         </w:rPr>
@@ -806,106 +806,56 @@
     </w:p>
     <w:p>
       <w:pPr>
-        <w:spacing w:after="40" w:line="264" w:lineRule="auto"/>
+        <w:spacing w:before="40" w:after="120"/>
+        <w:jc w:val="center"/>
         <w:rPr>
           <w:rFonts w:hint="eastAsia"/>
         </w:rPr>
       </w:pPr>
       <w:r>
         <w:rPr>
-          <w:color w:val="506E8C"/>
-          <w:sz w:val="18"/>
-        </w:rPr>
-        <w:t>【图：直线</w:t>
-      </w:r>
-      <w:r>
-        <w:rPr>
-          <w:color w:val="506E8C"/>
-          <w:sz w:val="18"/>
-        </w:rPr>
-        <w:t xml:space="preserve"> l</w:t>
-      </w:r>
-      <w:r>
-        <w:rPr>
-          <w:color w:val="506E8C"/>
-          <w:sz w:val="18"/>
-        </w:rPr>
-        <w:t>。直线上方放着一副三角尺。左边一把：底边贴在直线</w:t>
-      </w:r>
-      <w:r>
-        <w:rPr>
-          <w:color w:val="506E8C"/>
-          <w:sz w:val="18"/>
-        </w:rPr>
-        <w:t xml:space="preserve"> l </w:t>
-      </w:r>
-      <w:r>
-        <w:rPr>
-          <w:color w:val="506E8C"/>
-          <w:sz w:val="18"/>
-        </w:rPr>
-        <w:t>上，右侧为一条竖直边，斜边在左，三角形内画有直角符号。右边一把：左下角和右下角都落在直线</w:t>
-      </w:r>
-      <w:r>
-        <w:rPr>
-          <w:color w:val="506E8C"/>
-          <w:sz w:val="18"/>
-        </w:rPr>
-        <w:t xml:space="preserve"> l </w:t>
-      </w:r>
-      <w:r>
-        <w:rPr>
-          <w:color w:val="506E8C"/>
-          <w:sz w:val="18"/>
-        </w:rPr>
-        <w:t>上，左下角紧挨左边那把竖直边的下端；它靠左的一条边向上伸，与左边竖直边在上方相交，夹角标为</w:t>
-      </w:r>
-      <w:r>
-        <w:rPr>
-          <w:color w:val="506E8C"/>
-          <w:sz w:val="18"/>
-        </w:rPr>
-        <w:t xml:space="preserve"> 1</w:t>
-      </w:r>
-      <w:r>
-        <w:rPr>
-          <w:color w:val="506E8C"/>
-          <w:sz w:val="18"/>
-        </w:rPr>
-        <w:t>，三角形内也画有直角符号。</w:t>
-      </w:r>
-      <w:r>
-        <w:rPr>
-          <w:color w:val="506E8C"/>
-          <w:sz w:val="18"/>
-        </w:rPr>
-        <w:t xml:space="preserve">∠ 2 </w:t>
-      </w:r>
-      <w:r>
-        <w:rPr>
-          <w:color w:val="506E8C"/>
-          <w:sz w:val="18"/>
-        </w:rPr>
-        <w:t>标在直线</w:t>
-      </w:r>
-      <w:r>
-        <w:rPr>
-          <w:color w:val="506E8C"/>
-          <w:sz w:val="18"/>
-        </w:rPr>
-        <w:t xml:space="preserve"> l </w:t>
-      </w:r>
-      <w:r>
-        <w:rPr>
-          <w:color w:val="506E8C"/>
-          <w:sz w:val="18"/>
-        </w:rPr>
-        <w:t>下方，对准右边三角尺左下角与直线的交点。】</w:t>
+          <w:noProof/>
+        </w:rPr>
+        <w:drawing>
+          <wp:inline distT="0" distB="0" distL="0" distR="0" wp14:anchorId="24BBC174" wp14:editId="51F94F2A">
+            <wp:extent cx="2125440" cy="1550859"/>
+            <wp:effectExtent l="0" t="0" r="0" b="0"/>
+            <wp:docPr id="1" name="Picture 1"/>
+            <wp:cNvGraphicFramePr>
+              <a:graphicFrameLocks xmlns:a="http://schemas.openxmlformats.org/drawingml/2006/main" noChangeAspect="1"/>
+            </wp:cNvGraphicFramePr>
+            <a:graphic xmlns:a="http://schemas.openxmlformats.org/drawingml/2006/main">
+              <a:graphicData uri="http://schemas.openxmlformats.org/drawingml/2006/picture">
+                <pic:pic xmlns:pic="http://schemas.openxmlformats.org/drawingml/2006/picture">
+                  <pic:nvPicPr>
+                    <pic:cNvPr id="0" name="a_setsquares.jpg"/>
+                    <pic:cNvPicPr/>
+                  </pic:nvPicPr>
+                  <pic:blipFill>
+                    <a:blip r:embed="rId8"/>
+                    <a:stretch>
+                      <a:fillRect/>
+                    </a:stretch>
+                  </pic:blipFill>
+                  <pic:spPr>
+                    <a:xfrm>
+                      <a:off x="0" y="0"/>
+                      <a:ext cx="2125440" cy="1550859"/>
+                    </a:xfrm>
+                    <a:prstGeom prst="rect">
+                      <a:avLst/>
+                    </a:prstGeom>
+                  </pic:spPr>
+                </pic:pic>
+              </a:graphicData>
+            </a:graphic>
+          </wp:inline>
+        </w:drawing>
       </w:r>
     </w:p>
     <w:p>
       <w:pPr>
-        <w:spacing w:after="320" w:line="240" w:lineRule="auto"/>
+        <w:spacing w:after="160" w:line="240" w:lineRule="auto"/>
         <w:rPr>
           <w:rFonts w:hint="eastAsia"/>
         </w:rPr>
@@ -1004,7 +954,7 @@
     </w:p>
     <w:p>
       <w:pPr>
-        <w:spacing w:line="317" w:lineRule="auto"/>
+        <w:spacing w:after="80" w:line="288" w:lineRule="auto"/>
         <w:rPr>
           <w:rFonts w:hint="eastAsia"/>
         </w:rPr>
@@ -1015,7 +965,7 @@
     </w:p>
     <w:p>
       <w:pPr>
-        <w:spacing w:after="480" w:line="240" w:lineRule="auto"/>
+        <w:spacing w:after="160" w:line="240" w:lineRule="auto"/>
         <w:rPr>
           <w:rFonts w:hint="eastAsia"/>
         </w:rPr>
@@ -1023,7 +973,7 @@
     </w:p>
     <w:p>
       <w:pPr>
-        <w:spacing w:line="317" w:lineRule="auto"/>
+        <w:spacing w:after="80" w:line="288" w:lineRule="auto"/>
         <w:rPr>
           <w:rFonts w:hint="eastAsia"/>
         </w:rPr>
@@ -1034,7 +984,7 @@
     </w:p>
     <w:p>
       <w:pPr>
-        <w:spacing w:after="480" w:line="240" w:lineRule="auto"/>
+        <w:spacing w:after="160" w:line="240" w:lineRule="auto"/>
         <w:rPr>
           <w:rFonts w:hint="eastAsia"/>
         </w:rPr>
@@ -1042,7 +992,7 @@
     </w:p>
     <w:p>
       <w:pPr>
-        <w:spacing w:line="317" w:lineRule="auto"/>
+        <w:spacing w:after="80" w:line="288" w:lineRule="auto"/>
         <w:rPr>
           <w:rFonts w:hint="eastAsia"/>
         </w:rPr>
@@ -1053,7 +1003,7 @@
     </w:p>
     <w:p>
       <w:pPr>
-        <w:spacing w:after="480" w:line="240" w:lineRule="auto"/>
+        <w:spacing w:after="160" w:line="240" w:lineRule="auto"/>
         <w:rPr>
           <w:rFonts w:hint="eastAsia"/>
         </w:rPr>
@@ -1061,7 +1011,7 @@
     </w:p>
     <w:p>
       <w:pPr>
-        <w:spacing w:line="317" w:lineRule="auto"/>
+        <w:spacing w:after="80" w:line="288" w:lineRule="auto"/>
         <w:rPr>
           <w:rFonts w:hint="eastAsia"/>
         </w:rPr>
@@ -1072,22 +1022,56 @@
     </w:p>
     <w:p>
       <w:pPr>
-        <w:spacing w:after="40" w:line="264" w:lineRule="auto"/>
+        <w:spacing w:before="40" w:after="120"/>
+        <w:jc w:val="center"/>
         <w:rPr>
           <w:rFonts w:hint="eastAsia"/>
         </w:rPr>
       </w:pPr>
       <w:r>
         <w:rPr>
-          <w:color w:val="506E8C"/>
-          <w:sz w:val="18"/>
-        </w:rPr>
-        <w:t>【图：一架玩具飞机。旁边文字：原价：每架 140 元；优惠价：每架 108 元。】</w:t>
+          <w:noProof/>
+        </w:rPr>
+        <w:drawing>
+          <wp:inline distT="0" distB="0" distL="0" distR="0" wp14:anchorId="18255C68" wp14:editId="6C56C3F1">
+            <wp:extent cx="1535040" cy="1117145"/>
+            <wp:effectExtent l="0" t="0" r="0" b="0"/>
+            <wp:docPr id="980084297" name="Picture 1"/>
+            <wp:cNvGraphicFramePr>
+              <a:graphicFrameLocks xmlns:a="http://schemas.openxmlformats.org/drawingml/2006/main" noChangeAspect="1"/>
+            </wp:cNvGraphicFramePr>
+            <a:graphic xmlns:a="http://schemas.openxmlformats.org/drawingml/2006/main">
+              <a:graphicData uri="http://schemas.openxmlformats.org/drawingml/2006/picture">
+                <pic:pic xmlns:pic="http://schemas.openxmlformats.org/drawingml/2006/picture">
+                  <pic:nvPicPr>
+                    <pic:cNvPr id="0" name="a_plane.jpg"/>
+                    <pic:cNvPicPr/>
+                  </pic:nvPicPr>
+                  <pic:blipFill>
+                    <a:blip r:embed="rId9"/>
+                    <a:stretch>
+                      <a:fillRect/>
+                    </a:stretch>
+                  </pic:blipFill>
+                  <pic:spPr>
+                    <a:xfrm>
+                      <a:off x="0" y="0"/>
+                      <a:ext cx="1535040" cy="1117145"/>
+                    </a:xfrm>
+                    <a:prstGeom prst="rect">
+                      <a:avLst/>
+                    </a:prstGeom>
+                  </pic:spPr>
+                </pic:pic>
+              </a:graphicData>
+            </a:graphic>
+          </wp:inline>
+        </w:drawing>
       </w:r>
     </w:p>
     <w:p>
       <w:pPr>
-        <w:spacing w:after="480" w:line="240" w:lineRule="auto"/>
+        <w:spacing w:after="160" w:line="240" w:lineRule="auto"/>
         <w:rPr>
           <w:rFonts w:hint="eastAsia"/>
         </w:rPr>
@@ -1095,7 +1079,7 @@
     </w:p>
     <w:p>
       <w:pPr>
-        <w:spacing w:line="317" w:lineRule="auto"/>
+        <w:spacing w:after="80" w:line="288" w:lineRule="auto"/>
         <w:rPr>
           <w:rFonts w:hint="eastAsia"/>
         </w:rPr>
@@ -1106,22 +1090,56 @@
     </w:p>
     <w:p>
       <w:pPr>
-        <w:spacing w:after="40" w:line="264" w:lineRule="auto"/>
+        <w:spacing w:before="40" w:after="120"/>
+        <w:jc w:val="center"/>
         <w:rPr>
           <w:rFonts w:hint="eastAsia"/>
         </w:rPr>
       </w:pPr>
       <w:r>
         <w:rPr>
-          <w:color w:val="506E8C"/>
-          <w:sz w:val="18"/>
-        </w:rPr>
-        <w:t>【图：折线路线图。超市在最高点，学校在左下方，王欢家在右下方，两段路上都画有小刻度。超市右侧另有向上的指北箭头，箭头下有比例尺“200米”。折线在超市处形成一个角。】</w:t>
+          <w:noProof/>
+        </w:rPr>
+        <w:drawing>
+          <wp:inline distT="0" distB="0" distL="0" distR="0" wp14:anchorId="57A7DD4D" wp14:editId="5DE1AA6A">
+            <wp:extent cx="3247200" cy="1217099"/>
+            <wp:effectExtent l="0" t="0" r="0" b="0"/>
+            <wp:docPr id="2" name="Picture 2"/>
+            <wp:cNvGraphicFramePr>
+              <a:graphicFrameLocks xmlns:a="http://schemas.openxmlformats.org/drawingml/2006/main" noChangeAspect="1"/>
+            </wp:cNvGraphicFramePr>
+            <a:graphic xmlns:a="http://schemas.openxmlformats.org/drawingml/2006/main">
+              <a:graphicData uri="http://schemas.openxmlformats.org/drawingml/2006/picture">
+                <pic:pic xmlns:pic="http://schemas.openxmlformats.org/drawingml/2006/picture">
+                  <pic:nvPicPr>
+                    <pic:cNvPr id="0" name="a_route.jpg"/>
+                    <pic:cNvPicPr/>
+                  </pic:nvPicPr>
+                  <pic:blipFill>
+                    <a:blip r:embed="rId10"/>
+                    <a:stretch>
+                      <a:fillRect/>
+                    </a:stretch>
+                  </pic:blipFill>
+                  <pic:spPr>
+                    <a:xfrm>
+                      <a:off x="0" y="0"/>
+                      <a:ext cx="3247200" cy="1217099"/>
+                    </a:xfrm>
+                    <a:prstGeom prst="rect">
+                      <a:avLst/>
+                    </a:prstGeom>
+                  </pic:spPr>
+                </pic:pic>
+              </a:graphicData>
+            </a:graphic>
+          </wp:inline>
+        </w:drawing>
       </w:r>
     </w:p>
     <w:p>
       <w:pPr>
-        <w:spacing w:after="160" w:line="317" w:lineRule="auto"/>
+        <w:spacing w:after="40" w:line="288" w:lineRule="auto"/>
         <w:rPr>
           <w:rFonts w:hint="eastAsia"/>
         </w:rPr>
@@ -1132,7 +1150,7 @@
     </w:p>
     <w:p>
       <w:pPr>
-        <w:spacing w:after="480" w:line="240" w:lineRule="auto"/>
+        <w:spacing w:after="160" w:line="240" w:lineRule="auto"/>
         <w:rPr>
           <w:rFonts w:hint="eastAsia"/>
         </w:rPr>
@@ -1140,7 +1158,7 @@
     </w:p>
     <w:p>
       <w:pPr>
-        <w:spacing w:before="160" w:after="60" w:line="317" w:lineRule="auto"/>
+        <w:spacing w:before="80" w:after="60" w:line="288" w:lineRule="auto"/>
         <w:rPr>
           <w:rFonts w:hint="eastAsia"/>
         </w:rPr>
@@ -1156,7 +1174,7 @@
     </w:p>
     <w:p>
       <w:pPr>
-        <w:spacing w:line="317" w:lineRule="auto"/>
+        <w:spacing w:after="80" w:line="288" w:lineRule="auto"/>
         <w:rPr>
           <w:rFonts w:hint="eastAsia"/>
         </w:rPr>
@@ -1167,7 +1185,7 @@
     </w:p>
     <w:p>
       <w:pPr>
-        <w:spacing w:after="160" w:line="317" w:lineRule="auto"/>
+        <w:spacing w:after="40" w:line="288" w:lineRule="auto"/>
         <w:rPr>
           <w:rFonts w:hint="eastAsia"/>
         </w:rPr>
@@ -1178,7 +1196,7 @@
     </w:p>
     <w:p>
       <w:pPr>
-        <w:spacing w:line="317" w:lineRule="auto"/>
+        <w:spacing w:after="80" w:line="288" w:lineRule="auto"/>
         <w:rPr>
           <w:rFonts w:hint="eastAsia"/>
         </w:rPr>
@@ -1189,7 +1207,7 @@
     </w:p>
     <w:p>
       <w:pPr>
-        <w:spacing w:after="160" w:line="317" w:lineRule="auto"/>
+        <w:spacing w:after="40" w:line="288" w:lineRule="auto"/>
         <w:rPr>
           <w:rFonts w:hint="eastAsia"/>
         </w:rPr>
@@ -1200,7 +1218,7 @@
     </w:p>
     <w:p>
       <w:pPr>
-        <w:spacing w:line="317" w:lineRule="auto"/>
+        <w:spacing w:after="80" w:line="288" w:lineRule="auto"/>
         <w:rPr>
           <w:rFonts w:hint="eastAsia"/>
         </w:rPr>
@@ -1211,154 +1229,170 @@
     </w:p>
     <w:p>
       <w:pPr>
-        <w:spacing w:after="160" w:line="317" w:lineRule="auto"/>
+        <w:spacing w:before="40" w:after="120"/>
+        <w:jc w:val="center"/>
         <w:rPr>
           <w:rFonts w:hint="eastAsia"/>
         </w:rPr>
       </w:pPr>
       <w:r>
-        <w:t>A. 【图：正方形，两条对角线以及过中心的横线、竖线，分成 8 个小三角形。】</w:t>
+        <w:rPr>
+          <w:noProof/>
+        </w:rPr>
+        <w:drawing>
+          <wp:inline distT="0" distB="0" distL="0" distR="0" wp14:anchorId="35537D60" wp14:editId="5EFD8FAF">
+            <wp:extent cx="3690000" cy="972781"/>
+            <wp:effectExtent l="0" t="0" r="0" b="0"/>
+            <wp:docPr id="3" name="Picture 3"/>
+            <wp:cNvGraphicFramePr>
+              <a:graphicFrameLocks xmlns:a="http://schemas.openxmlformats.org/drawingml/2006/main" noChangeAspect="1"/>
+            </wp:cNvGraphicFramePr>
+            <a:graphic xmlns:a="http://schemas.openxmlformats.org/drawingml/2006/main">
+              <a:graphicData uri="http://schemas.openxmlformats.org/drawingml/2006/picture">
+                <pic:pic xmlns:pic="http://schemas.openxmlformats.org/drawingml/2006/picture">
+                  <pic:nvPicPr>
+                    <pic:cNvPr id="0" name="a_fold_abc.jpg"/>
+                    <pic:cNvPicPr/>
+                  </pic:nvPicPr>
+                  <pic:blipFill>
+                    <a:blip r:embed="rId11"/>
+                    <a:stretch>
+                      <a:fillRect/>
+                    </a:stretch>
+                  </pic:blipFill>
+                  <pic:spPr>
+                    <a:xfrm>
+                      <a:off x="0" y="0"/>
+                      <a:ext cx="3690000" cy="972781"/>
+                    </a:xfrm>
+                    <a:prstGeom prst="rect">
+                      <a:avLst/>
+                    </a:prstGeom>
+                  </pic:spPr>
+                </pic:pic>
+              </a:graphicData>
+            </a:graphic>
+          </wp:inline>
+        </w:drawing>
       </w:r>
     </w:p>
     <w:p>
       <w:pPr>
-        <w:spacing w:after="160" w:line="317" w:lineRule="auto"/>
+        <w:spacing w:after="80" w:line="288" w:lineRule="auto"/>
         <w:rPr>
           <w:rFonts w:hint="eastAsia"/>
         </w:rPr>
       </w:pPr>
       <w:r>
-        <w:t>B. 【图：正六边形，中心与六个顶点相连，分成 6 个三角形。】</w:t>
+        <w:t>4. 一个量角器被磨损得大多数刻度已经看不清了，只留下 20°、40°、80°、120° 这 4 条刻度线（均为内圈刻度），用这个量角器可以一次性画出（________）种大小不等的角。</w:t>
       </w:r>
     </w:p>
     <w:p>
       <w:pPr>
-        <w:spacing w:after="160" w:line="317" w:lineRule="auto"/>
+        <w:spacing w:after="40" w:line="288" w:lineRule="auto"/>
         <w:rPr>
           <w:rFonts w:hint="eastAsia"/>
         </w:rPr>
       </w:pPr>
       <w:r>
-        <w:t>C. 【图：圆，过圆心有横、竖两条直径和两条斜直径，分成 8 份。】</w:t>
+        <w:t>A. 5　　B. 6　　C. 7</w:t>
       </w:r>
     </w:p>
     <w:p>
       <w:pPr>
-        <w:spacing w:line="317" w:lineRule="auto"/>
+        <w:spacing w:before="120" w:after="0"/>
+        <w:jc w:val="center"/>
         <w:rPr>
           <w:rFonts w:hint="eastAsia"/>
         </w:rPr>
       </w:pPr>
       <w:r>
-        <w:t>4. 一个量角器被磨损得大多数刻度已经看不清了，只留下 20°、40°、80°、120° 这 4 条刻度线（均为内圈刻度），用这个量角器可以一次性画出（________）种大小不等的角。</w:t>
+        <w:rPr>
+          <w:color w:val="506E8C"/>
+          <w:sz w:val="18"/>
+        </w:rPr>
+        <w:t>数学 · 四上 · 期中练习　第 2 页（共 4 页）</w:t>
       </w:r>
     </w:p>
     <w:p>
       <w:pPr>
-        <w:spacing w:after="160" w:line="317" w:lineRule="auto"/>
         <w:rPr>
           <w:rFonts w:hint="eastAsia"/>
         </w:rPr>
       </w:pPr>
       <w:r>
-        <w:t>A. 5　　B. 6　　C. 7</w:t>
+        <w:rPr>
+          <w:rFonts w:hint="eastAsia"/>
+        </w:rPr>
+        <w:br w:type="page"/>
       </w:r>
     </w:p>
     <w:p>
       <w:pPr>
-        <w:spacing w:before="120" w:after="0"/>
-        <w:jc w:val="center"/>
+        <w:spacing w:after="60" w:line="300" w:lineRule="auto"/>
         <w:rPr>
           <w:rFonts w:hint="eastAsia"/>
         </w:rPr>
       </w:pPr>
       <w:r>
-        <w:rPr>
-          <w:color w:val="506E8C"/>
-          <w:sz w:val="18"/>
-        </w:rPr>
-        <w:t>数学 · 四上 · 期中练习　第 2 页（共 4 页）</w:t>
+        <w:t>（续）二、选择题</w:t>
       </w:r>
     </w:p>
     <w:p>
       <w:pPr>
+        <w:spacing w:after="100" w:line="300" w:lineRule="auto"/>
         <w:rPr>
           <w:rFonts w:hint="eastAsia"/>
         </w:rPr>
       </w:pPr>
       <w:r>
-        <w:rPr>
-          <w:rFonts w:hint="eastAsia"/>
-        </w:rPr>
-        <w:br w:type="page"/>
+        <w:t>5. 2026 年是中国工农红军长征胜利 90 周年。广西某小学的老师带着 110 人一起去湘江战役纪念馆开展红色研学活动。已知车票每张 36 元（老师免费），他们应该准备多少钱买车票？下面估算方法合理的是（________）。</w:t>
       </w:r>
     </w:p>
     <w:p>
       <w:pPr>
-        <w:spacing w:after="80" w:line="307" w:lineRule="auto"/>
+        <w:spacing w:after="60" w:line="300" w:lineRule="auto"/>
         <w:rPr>
           <w:rFonts w:hint="eastAsia"/>
         </w:rPr>
       </w:pPr>
       <w:r>
-        <w:t>（续）二、选择题</w:t>
+        <w:t>A. 把 110 估小为 100，36× 100=3600（元），准备 3600 元就够了</w:t>
       </w:r>
     </w:p>
     <w:p>
       <w:pPr>
-        <w:spacing w:after="120" w:line="307" w:lineRule="auto"/>
+        <w:spacing w:after="60" w:line="300" w:lineRule="auto"/>
         <w:rPr>
           <w:rFonts w:hint="eastAsia"/>
         </w:rPr>
       </w:pPr>
       <w:r>
-        <w:t>5. 2026 年是中国工农红军长征胜利 90 周年。广西某小学的老师带着 110 人一起去湘江战役纪念馆开展红色研学活动。已知车票每张 36 元（老师免费），他们应该准备多少钱买车票？下面估算方法合理的是（________）。</w:t>
+        <w:t>B. 把 36 估大为 40，40× 110=4400（元），准备 4400 元就够了</w:t>
       </w:r>
     </w:p>
     <w:p>
       <w:pPr>
-        <w:spacing w:after="80" w:line="307" w:lineRule="auto"/>
+        <w:spacing w:after="60" w:line="300" w:lineRule="auto"/>
         <w:rPr>
           <w:rFonts w:hint="eastAsia"/>
         </w:rPr>
       </w:pPr>
       <w:r>
-        <w:t>A. 把 110 估小为 100，36× 100=3600（元），准备 3600 元就够了</w:t>
+        <w:t>C. 把 36 估小为 30，30× 110=3300（元），准备 3300 元就够了</w:t>
       </w:r>
     </w:p>
     <w:p>
       <w:pPr>
-        <w:spacing w:after="80" w:line="307" w:lineRule="auto"/>
+        <w:spacing w:after="240" w:line="240" w:lineRule="auto"/>
         <w:rPr>
           <w:rFonts w:hint="eastAsia"/>
         </w:rPr>
       </w:pPr>
-      <w:r>
-        <w:t>B. 把 36 估大为 40，40× 110=4400（元），准备 4400 元就够了</w:t>
-      </w:r>
     </w:p>
     <w:p>
       <w:pPr>
-        <w:spacing w:after="80" w:line="307" w:lineRule="auto"/>
-        <w:rPr>
-          <w:rFonts w:hint="eastAsia"/>
-        </w:rPr>
-      </w:pPr>
-      <w:r>
-        <w:t>C. 把 36 估小为 30，30× 110=3300（元），准备 3300 元就够了</w:t>
-      </w:r>
-    </w:p>
-    <w:p>
-      <w:pPr>
-        <w:spacing w:after="320" w:line="240" w:lineRule="auto"/>
-        <w:rPr>
-          <w:rFonts w:hint="eastAsia"/>
-        </w:rPr>
-      </w:pPr>
-    </w:p>
-    <w:p>
-      <w:pPr>
-        <w:spacing w:before="120" w:after="60" w:line="307" w:lineRule="auto"/>
+        <w:spacing w:before="100" w:after="60" w:line="300" w:lineRule="auto"/>
         <w:rPr>
           <w:rFonts w:hint="eastAsia"/>
         </w:rPr>
@@ -1374,7 +1408,7 @@
     </w:p>
     <w:p>
       <w:pPr>
-        <w:spacing w:after="120" w:line="307" w:lineRule="auto"/>
+        <w:spacing w:after="100" w:line="300" w:lineRule="auto"/>
         <w:rPr>
           <w:rFonts w:hint="eastAsia"/>
         </w:rPr>
@@ -1385,7 +1419,7 @@
     </w:p>
     <w:p>
       <w:pPr>
-        <w:spacing w:after="80" w:line="307" w:lineRule="auto"/>
+        <w:spacing w:after="60" w:line="300" w:lineRule="auto"/>
         <w:rPr>
           <w:rFonts w:hint="eastAsia"/>
         </w:rPr>
@@ -1396,7 +1430,7 @@
     </w:p>
     <w:p>
       <w:pPr>
-        <w:spacing w:after="80" w:line="307" w:lineRule="auto"/>
+        <w:spacing w:after="60" w:line="300" w:lineRule="auto"/>
         <w:rPr>
           <w:rFonts w:hint="eastAsia"/>
         </w:rPr>
@@ -1407,7 +1441,7 @@
     </w:p>
     <w:p>
       <w:pPr>
-        <w:spacing w:after="320" w:line="240" w:lineRule="auto"/>
+        <w:spacing w:after="240" w:line="240" w:lineRule="auto"/>
         <w:rPr>
           <w:rFonts w:hint="eastAsia"/>
         </w:rPr>
@@ -1415,7 +1449,7 @@
     </w:p>
     <w:p>
       <w:pPr>
-        <w:spacing w:after="120" w:line="307" w:lineRule="auto"/>
+        <w:spacing w:after="100" w:line="300" w:lineRule="auto"/>
         <w:rPr>
           <w:rFonts w:hint="eastAsia"/>
         </w:rPr>
@@ -1426,7 +1460,7 @@
     </w:p>
     <w:p>
       <w:pPr>
-        <w:spacing w:after="80" w:line="307" w:lineRule="auto"/>
+        <w:spacing w:after="60" w:line="300" w:lineRule="auto"/>
         <w:rPr>
           <w:rFonts w:hint="eastAsia"/>
         </w:rPr>
@@ -1437,7 +1471,7 @@
     </w:p>
     <w:p>
       <w:pPr>
-        <w:spacing w:after="320" w:line="240" w:lineRule="auto"/>
+        <w:spacing w:after="240" w:line="240" w:lineRule="auto"/>
         <w:rPr>
           <w:rFonts w:hint="eastAsia"/>
         </w:rPr>
@@ -1445,7 +1479,7 @@
     </w:p>
     <w:p>
       <w:pPr>
-        <w:spacing w:before="120" w:after="60" w:line="307" w:lineRule="auto"/>
+        <w:spacing w:before="100" w:after="60" w:line="300" w:lineRule="auto"/>
         <w:rPr>
           <w:rFonts w:hint="eastAsia"/>
         </w:rPr>
@@ -1461,7 +1495,7 @@
     </w:p>
     <w:p>
       <w:pPr>
-        <w:spacing w:after="120" w:line="307" w:lineRule="auto"/>
+        <w:spacing w:after="100" w:line="300" w:lineRule="auto"/>
         <w:rPr>
           <w:rFonts w:hint="eastAsia"/>
         </w:rPr>
@@ -1472,22 +1506,56 @@
     </w:p>
     <w:p>
       <w:pPr>
-        <w:spacing w:after="40" w:line="264" w:lineRule="auto"/>
+        <w:spacing w:before="40" w:after="120"/>
+        <w:jc w:val="center"/>
         <w:rPr>
           <w:rFonts w:hint="eastAsia"/>
         </w:rPr>
       </w:pPr>
       <w:r>
         <w:rPr>
-          <w:color w:val="506E8C"/>
-          <w:sz w:val="18"/>
-        </w:rPr>
-        <w:t>【图：一条水平射线，箭头朝右。左端上方标 A，靠右端上方标 B。】</w:t>
+          <w:noProof/>
+        </w:rPr>
+        <w:drawing>
+          <wp:inline distT="0" distB="0" distL="0" distR="0" wp14:anchorId="7CD5242B" wp14:editId="17D9848D">
+            <wp:extent cx="2916000" cy="694039"/>
+            <wp:effectExtent l="0" t="0" r="0" b="0"/>
+            <wp:docPr id="1907655800" name="Picture 1"/>
+            <wp:cNvGraphicFramePr>
+              <a:graphicFrameLocks xmlns:a="http://schemas.openxmlformats.org/drawingml/2006/main" noChangeAspect="1"/>
+            </wp:cNvGraphicFramePr>
+            <a:graphic xmlns:a="http://schemas.openxmlformats.org/drawingml/2006/main">
+              <a:graphicData uri="http://schemas.openxmlformats.org/drawingml/2006/picture">
+                <pic:pic xmlns:pic="http://schemas.openxmlformats.org/drawingml/2006/picture">
+                  <pic:nvPicPr>
+                    <pic:cNvPr id="0" name="a_ray_ab.jpg"/>
+                    <pic:cNvPicPr/>
+                  </pic:nvPicPr>
+                  <pic:blipFill>
+                    <a:blip r:embed="rId12"/>
+                    <a:stretch>
+                      <a:fillRect/>
+                    </a:stretch>
+                  </pic:blipFill>
+                  <pic:spPr>
+                    <a:xfrm>
+                      <a:off x="0" y="0"/>
+                      <a:ext cx="2916000" cy="694039"/>
+                    </a:xfrm>
+                    <a:prstGeom prst="rect">
+                      <a:avLst/>
+                    </a:prstGeom>
+                  </pic:spPr>
+                </pic:pic>
+              </a:graphicData>
+            </a:graphic>
+          </wp:inline>
+        </w:drawing>
       </w:r>
     </w:p>
     <w:p>
       <w:pPr>
-        <w:spacing w:after="1280" w:line="240" w:lineRule="auto"/>
+        <w:spacing w:after="1040" w:line="240" w:lineRule="auto"/>
         <w:rPr>
           <w:rFonts w:hint="eastAsia"/>
         </w:rPr>
@@ -1495,7 +1563,7 @@
     </w:p>
     <w:p>
       <w:pPr>
-        <w:spacing w:after="120" w:line="307" w:lineRule="auto"/>
+        <w:spacing w:after="100" w:line="300" w:lineRule="auto"/>
         <w:rPr>
           <w:rFonts w:hint="eastAsia"/>
         </w:rPr>
@@ -1506,7 +1574,7 @@
     </w:p>
     <w:p>
       <w:pPr>
-        <w:spacing w:after="1280" w:line="240" w:lineRule="auto"/>
+        <w:spacing w:after="1040" w:line="240" w:lineRule="auto"/>
         <w:rPr>
           <w:rFonts w:hint="eastAsia"/>
         </w:rPr>
@@ -1514,7 +1582,7 @@
     </w:p>
     <w:p>
       <w:pPr>
-        <w:spacing w:before="120" w:after="60" w:line="307" w:lineRule="auto"/>
+        <w:spacing w:before="100" w:after="60" w:line="300" w:lineRule="auto"/>
         <w:rPr>
           <w:rFonts w:hint="eastAsia"/>
         </w:rPr>
@@ -1530,7 +1598,7 @@
     </w:p>
     <w:p>
       <w:pPr>
-        <w:spacing w:after="120" w:line="307" w:lineRule="auto"/>
+        <w:spacing w:after="100" w:line="300" w:lineRule="auto"/>
         <w:rPr>
           <w:rFonts w:hint="eastAsia"/>
         </w:rPr>
@@ -1541,7 +1609,7 @@
     </w:p>
     <w:p>
       <w:pPr>
-        <w:spacing w:after="160" w:line="324" w:lineRule="auto"/>
+        <w:spacing w:after="140" w:line="324" w:lineRule="auto"/>
         <w:rPr>
           <w:rFonts w:hint="eastAsia"/>
         </w:rPr>
@@ -1552,7 +1620,7 @@
     </w:p>
     <w:p>
       <w:pPr>
-        <w:spacing w:after="160" w:line="324" w:lineRule="auto"/>
+        <w:spacing w:after="140" w:line="324" w:lineRule="auto"/>
         <w:rPr>
           <w:rFonts w:hint="eastAsia"/>
         </w:rPr>
@@ -1563,103 +1631,137 @@
     </w:p>
     <w:p>
       <w:pPr>
-        <w:spacing w:after="160" w:line="324" w:lineRule="auto"/>
+        <w:spacing w:before="120" w:after="0"/>
+        <w:jc w:val="center"/>
         <w:rPr>
           <w:rFonts w:hint="eastAsia"/>
         </w:rPr>
       </w:pPr>
       <w:r>
-        <w:t xml:space="preserve">　　________________________________________________</w:t>
+        <w:rPr>
+          <w:color w:val="506E8C"/>
+          <w:sz w:val="18"/>
+        </w:rPr>
+        <w:t>数学 · 四上 · 期中练习　第 3 页（共 4 页）</w:t>
       </w:r>
     </w:p>
     <w:p>
       <w:pPr>
-        <w:spacing w:before="120" w:after="0"/>
-        <w:jc w:val="center"/>
         <w:rPr>
           <w:rFonts w:hint="eastAsia"/>
         </w:rPr>
       </w:pPr>
       <w:r>
         <w:rPr>
-          <w:color w:val="506E8C"/>
-          <w:sz w:val="18"/>
-        </w:rPr>
-        <w:t>数学 · 四上 · 期中练习　第 3 页（共 4 页）</w:t>
+          <w:rFonts w:hint="eastAsia"/>
+        </w:rPr>
+        <w:br w:type="page"/>
       </w:r>
     </w:p>
     <w:p>
       <w:pPr>
+        <w:spacing w:after="60"/>
         <w:rPr>
           <w:rFonts w:hint="eastAsia"/>
         </w:rPr>
       </w:pPr>
       <w:r>
-        <w:rPr>
-          <w:rFonts w:hint="eastAsia"/>
-        </w:rPr>
-        <w:br w:type="page"/>
+        <w:t>2. 平盘因其浅底盘身被广泛用于盛装菜肴、摆放水果及装饰。</w:t>
       </w:r>
     </w:p>
     <w:p>
       <w:pPr>
-        <w:spacing w:after="120" w:line="307" w:lineRule="auto"/>
+        <w:spacing w:after="80" w:line="240" w:lineRule="auto"/>
         <w:rPr>
           <w:rFonts w:hint="eastAsia"/>
         </w:rPr>
       </w:pPr>
-      <w:r>
-        <w:t>2. 平盘因其浅底盘身被广泛用于盛装菜肴、摆放水果及装饰。</w:t>
-      </w:r>
     </w:p>
     <w:p>
       <w:pPr>
-        <w:spacing w:after="320" w:line="240" w:lineRule="auto"/>
+        <w:spacing w:after="60"/>
         <w:rPr>
           <w:rFonts w:hint="eastAsia"/>
         </w:rPr>
       </w:pPr>
+      <w:r>
+        <w:t>（1）一摞有 13 个平盘，40 摞共有多少个平盘？（5 分）</w:t>
+      </w:r>
     </w:p>
     <w:p>
       <w:pPr>
-        <w:spacing w:after="120" w:line="307" w:lineRule="auto"/>
+        <w:spacing w:before="40" w:after="120"/>
+        <w:jc w:val="center"/>
         <w:rPr>
           <w:rFonts w:hint="eastAsia"/>
         </w:rPr>
       </w:pPr>
       <w:r>
-        <w:t>（1）一摞有 13 个平盘，40 摞共有多少个平盘？（5 分）</w:t>
+        <w:rPr>
+          <w:noProof/>
+        </w:rPr>
+        <w:drawing>
+          <wp:inline distT="0" distB="0" distL="0" distR="0" wp14:anchorId="3E961371" wp14:editId="1E74A866">
+            <wp:extent cx="1623600" cy="1217700"/>
+            <wp:effectExtent l="0" t="0" r="0" b="0"/>
+            <wp:docPr id="1538109906" name="Picture 1"/>
+            <wp:cNvGraphicFramePr>
+              <a:graphicFrameLocks xmlns:a="http://schemas.openxmlformats.org/drawingml/2006/main" noChangeAspect="1"/>
+            </wp:cNvGraphicFramePr>
+            <a:graphic xmlns:a="http://schemas.openxmlformats.org/drawingml/2006/main">
+              <a:graphicData uri="http://schemas.openxmlformats.org/drawingml/2006/picture">
+                <pic:pic xmlns:pic="http://schemas.openxmlformats.org/drawingml/2006/picture">
+                  <pic:nvPicPr>
+                    <pic:cNvPr id="0" name="a_plates.jpg"/>
+                    <pic:cNvPicPr/>
+                  </pic:nvPicPr>
+                  <pic:blipFill>
+                    <a:blip r:embed="rId13"/>
+                    <a:stretch>
+                      <a:fillRect/>
+                    </a:stretch>
+                  </pic:blipFill>
+                  <pic:spPr>
+                    <a:xfrm>
+                      <a:off x="0" y="0"/>
+                      <a:ext cx="1623600" cy="1217700"/>
+                    </a:xfrm>
+                    <a:prstGeom prst="rect">
+                      <a:avLst/>
+                    </a:prstGeom>
+                  </pic:spPr>
+                </pic:pic>
+              </a:graphicData>
+            </a:graphic>
+          </wp:inline>
+        </w:drawing>
       </w:r>
     </w:p>
     <w:p>
       <w:pPr>
-        <w:spacing w:after="40" w:line="264" w:lineRule="auto"/>
+        <w:spacing w:after="100" w:line="324" w:lineRule="auto"/>
         <w:rPr>
           <w:rFonts w:hint="eastAsia"/>
         </w:rPr>
       </w:pPr>
       <w:r>
-        <w:rPr>
-          <w:color w:val="506E8C"/>
-          <w:sz w:val="18"/>
-        </w:rPr>
-        <w:t>【图：并排三摞平盘，右边有省略号，表示后面还有很多摞。】</w:t>
+        <w:t xml:space="preserve">　　________________________________________________</w:t>
       </w:r>
     </w:p>
     <w:p>
       <w:pPr>
-        <w:spacing w:after="160" w:line="324" w:lineRule="auto"/>
+        <w:spacing w:after="60"/>
         <w:rPr>
           <w:rFonts w:hint="eastAsia"/>
         </w:rPr>
       </w:pPr>
       <w:r>
-        <w:t xml:space="preserve">　　________________________________________________</w:t>
+        <w:t>（2）1 个平盘 6 元，40 摞平盘可以卖多少钱？（5 分）</w:t>
       </w:r>
     </w:p>
     <w:p>
       <w:pPr>
-        <w:spacing w:after="160" w:line="324" w:lineRule="auto"/>
+        <w:spacing w:after="100" w:line="324" w:lineRule="auto"/>
         <w:rPr>
           <w:rFonts w:hint="eastAsia"/>
         </w:rPr>
@@ -1670,29 +1772,67 @@
     </w:p>
     <w:p>
       <w:pPr>
-        <w:spacing w:after="160" w:line="324" w:lineRule="auto"/>
+        <w:spacing w:after="60"/>
         <w:rPr>
           <w:rFonts w:hint="eastAsia"/>
         </w:rPr>
       </w:pPr>
       <w:r>
-        <w:t xml:space="preserve">　　________________________________________________</w:t>
+        <w:t>3. 厨房的一款折叠推拉门合拢后的示意图如下，当全部拉开后，宽增加了 12 分米，那么全部拉开后整个门的面积是多少？（重叠部分忽略不计）（5 分）</w:t>
       </w:r>
     </w:p>
     <w:p>
       <w:pPr>
-        <w:spacing w:after="120" w:line="307" w:lineRule="auto"/>
+        <w:spacing w:before="40" w:after="120"/>
+        <w:jc w:val="center"/>
         <w:rPr>
           <w:rFonts w:hint="eastAsia"/>
         </w:rPr>
       </w:pPr>
       <w:r>
-        <w:t>（2）1 个平盘 6 元，40 摞平盘可以卖多少钱？（5 分）</w:t>
+        <w:rPr>
+          <w:noProof/>
+        </w:rPr>
+        <w:drawing>
+          <wp:inline distT="0" distB="0" distL="0" distR="0" wp14:anchorId="7C6D1C6E" wp14:editId="00E89DD4">
+            <wp:extent cx="1623600" cy="1068870"/>
+            <wp:effectExtent l="0" t="0" r="0" b="0"/>
+            <wp:docPr id="815998521" name="Picture 2"/>
+            <wp:cNvGraphicFramePr>
+              <a:graphicFrameLocks xmlns:a="http://schemas.openxmlformats.org/drawingml/2006/main" noChangeAspect="1"/>
+            </wp:cNvGraphicFramePr>
+            <a:graphic xmlns:a="http://schemas.openxmlformats.org/drawingml/2006/main">
+              <a:graphicData uri="http://schemas.openxmlformats.org/drawingml/2006/picture">
+                <pic:pic xmlns:pic="http://schemas.openxmlformats.org/drawingml/2006/picture">
+                  <pic:nvPicPr>
+                    <pic:cNvPr id="0" name="a_door.jpg"/>
+                    <pic:cNvPicPr/>
+                  </pic:nvPicPr>
+                  <pic:blipFill>
+                    <a:blip r:embed="rId14"/>
+                    <a:stretch>
+                      <a:fillRect/>
+                    </a:stretch>
+                  </pic:blipFill>
+                  <pic:spPr>
+                    <a:xfrm>
+                      <a:off x="0" y="0"/>
+                      <a:ext cx="1623600" cy="1068870"/>
+                    </a:xfrm>
+                    <a:prstGeom prst="rect">
+                      <a:avLst/>
+                    </a:prstGeom>
+                  </pic:spPr>
+                </pic:pic>
+              </a:graphicData>
+            </a:graphic>
+          </wp:inline>
+        </w:drawing>
       </w:r>
     </w:p>
     <w:p>
       <w:pPr>
-        <w:spacing w:after="160" w:line="324" w:lineRule="auto"/>
+        <w:spacing w:after="100" w:line="324" w:lineRule="auto"/>
         <w:rPr>
           <w:rFonts w:hint="eastAsia"/>
         </w:rPr>
@@ -1703,55 +1843,60 @@
     </w:p>
     <w:p>
       <w:pPr>
-        <w:spacing w:after="160" w:line="324" w:lineRule="auto"/>
+        <w:spacing w:after="60"/>
         <w:rPr>
           <w:rFonts w:hint="eastAsia"/>
         </w:rPr>
       </w:pPr>
       <w:r>
-        <w:t xml:space="preserve">　　________________________________________________</w:t>
+        <w:t>4. 炒锅是常见的烹饪器具，主要适用于煎、炒、蒸、炖等多种烹饪方式。下面是乐乐统计的周末两天卖出的 3 款炒锅的数量。店里卖这 3 款炒锅一共收入多少钱？（6 分）</w:t>
       </w:r>
     </w:p>
     <w:p>
       <w:pPr>
-        <w:spacing w:after="160" w:line="324" w:lineRule="auto"/>
+        <w:spacing w:after="40"/>
         <w:rPr>
           <w:rFonts w:hint="eastAsia"/>
         </w:rPr>
       </w:pPr>
       <w:r>
-        <w:t xml:space="preserve">　　________________________________________________</w:t>
+        <w:rPr>
+          <w:sz w:val="20"/>
+        </w:rPr>
+        <w:t>款式　A 款　B 款　C 款</w:t>
       </w:r>
     </w:p>
     <w:p>
       <w:pPr>
-        <w:spacing w:after="120" w:line="307" w:lineRule="auto"/>
+        <w:spacing w:after="40"/>
         <w:rPr>
           <w:rFonts w:hint="eastAsia"/>
         </w:rPr>
       </w:pPr>
       <w:r>
-        <w:t>3. 厨房的一款折叠推拉门合拢后的示意图如下，当全部拉开后，宽增加了 12 分米，那么全部拉开后整个门的面积是多少？（重叠部分忽略不计）（5 分）</w:t>
+        <w:rPr>
+          <w:sz w:val="20"/>
+        </w:rPr>
+        <w:t>售出数量/个　13　14　17</w:t>
       </w:r>
     </w:p>
     <w:p>
       <w:pPr>
-        <w:spacing w:after="40" w:line="264" w:lineRule="auto"/>
+        <w:spacing w:after="40"/>
         <w:rPr>
           <w:rFonts w:hint="eastAsia"/>
         </w:rPr>
       </w:pPr>
       <w:r>
         <w:rPr>
-          <w:color w:val="506E8C"/>
-          <w:sz w:val="18"/>
-        </w:rPr>
-        <w:t>【图：一个竖着的长方形门。长方形内写着“144平方分米”，底边下方标着“6分米”。】</w:t>
+          <w:sz w:val="20"/>
+        </w:rPr>
+        <w:t>每个价格/元　140　165　206</w:t>
       </w:r>
     </w:p>
     <w:p>
       <w:pPr>
-        <w:spacing w:after="160" w:line="324" w:lineRule="auto"/>
+        <w:spacing w:after="100" w:line="324" w:lineRule="auto"/>
         <w:rPr>
           <w:rFonts w:hint="eastAsia"/>
         </w:rPr>
@@ -1762,163 +1907,67 @@
     </w:p>
     <w:p>
       <w:pPr>
-        <w:spacing w:after="160" w:line="324" w:lineRule="auto"/>
+        <w:spacing w:after="60"/>
         <w:rPr>
           <w:rFonts w:hint="eastAsia"/>
         </w:rPr>
       </w:pPr>
       <w:r>
-        <w:t xml:space="preserve">　　________________________________________________</w:t>
+        <w:t>5. 南宋朱熹取《礼记》之《大学》《中庸》篇，分章注释，与《论语》《孟子》合为“四书”。实验小学在美文诵读比赛中，有 42 名同学获得优秀奖，校长准备花 5000 元为这些获奖同学买同样的书作为奖品，每人一套。你认为校长应该选购哪套图书（使剩余的钱尽量少）？买这些奖品一共要花多少元？（7 分）</w:t>
       </w:r>
     </w:p>
     <w:p>
       <w:pPr>
-        <w:spacing w:after="160" w:line="324" w:lineRule="auto"/>
+        <w:spacing w:before="40" w:after="120"/>
+        <w:jc w:val="center"/>
         <w:rPr>
           <w:rFonts w:hint="eastAsia"/>
         </w:rPr>
       </w:pPr>
       <w:r>
-        <w:t xml:space="preserve">　　________________________________________________</w:t>
+        <w:rPr>
+          <w:noProof/>
+        </w:rPr>
+        <w:drawing>
+          <wp:inline distT="0" distB="0" distL="0" distR="0" wp14:anchorId="76FB76D9" wp14:editId="280B62D0">
+            <wp:extent cx="3099600" cy="1351108"/>
+            <wp:effectExtent l="0" t="0" r="0" b="0"/>
+            <wp:docPr id="1504910585" name="Picture 3"/>
+            <wp:cNvGraphicFramePr>
+              <a:graphicFrameLocks xmlns:a="http://schemas.openxmlformats.org/drawingml/2006/main" noChangeAspect="1"/>
+            </wp:cNvGraphicFramePr>
+            <a:graphic xmlns:a="http://schemas.openxmlformats.org/drawingml/2006/main">
+              <a:graphicData uri="http://schemas.openxmlformats.org/drawingml/2006/picture">
+                <pic:pic xmlns:pic="http://schemas.openxmlformats.org/drawingml/2006/picture">
+                  <pic:nvPicPr>
+                    <pic:cNvPr id="0" name="a_books.jpg"/>
+                    <pic:cNvPicPr/>
+                  </pic:nvPicPr>
+                  <pic:blipFill>
+                    <a:blip r:embed="rId15"/>
+                    <a:stretch>
+                      <a:fillRect/>
+                    </a:stretch>
+                  </pic:blipFill>
+                  <pic:spPr>
+                    <a:xfrm>
+                      <a:off x="0" y="0"/>
+                      <a:ext cx="3099600" cy="1351108"/>
+                    </a:xfrm>
+                    <a:prstGeom prst="rect">
+                      <a:avLst/>
+                    </a:prstGeom>
+                  </pic:spPr>
+                </pic:pic>
+              </a:graphicData>
+            </a:graphic>
+          </wp:inline>
+        </w:drawing>
       </w:r>
     </w:p>
     <w:p>
       <w:pPr>
-        <w:spacing w:after="120" w:line="307" w:lineRule="auto"/>
-        <w:rPr>
-          <w:rFonts w:hint="eastAsia"/>
-        </w:rPr>
-      </w:pPr>
-      <w:r>
-        <w:t>4. 炒锅是常见的烹饪器具，主要适用于煎、炒、蒸、炖等多种烹饪方式。下面是乐乐统计的周末两天卖出的 3 款炒锅的数量。店里卖这 3 款炒锅一共收入多少钱？（6 分）</w:t>
-      </w:r>
-    </w:p>
-    <w:p>
-      <w:pPr>
-        <w:spacing w:after="40" w:line="307" w:lineRule="auto"/>
-        <w:rPr>
-          <w:rFonts w:hint="eastAsia"/>
-        </w:rPr>
-      </w:pPr>
-      <w:r>
-        <w:rPr>
-          <w:sz w:val="20"/>
-        </w:rPr>
-        <w:t>款式　A 款　B 款　C 款</w:t>
-      </w:r>
-    </w:p>
-    <w:p>
-      <w:pPr>
-        <w:spacing w:after="40" w:line="307" w:lineRule="auto"/>
-        <w:rPr>
-          <w:rFonts w:hint="eastAsia"/>
-        </w:rPr>
-      </w:pPr>
-      <w:r>
-        <w:rPr>
-          <w:sz w:val="20"/>
-        </w:rPr>
-        <w:t>售出数量/个　13　14　17</w:t>
-      </w:r>
-    </w:p>
-    <w:p>
-      <w:pPr>
-        <w:spacing w:after="40" w:line="307" w:lineRule="auto"/>
-        <w:rPr>
-          <w:rFonts w:hint="eastAsia"/>
-        </w:rPr>
-      </w:pPr>
-      <w:r>
-        <w:rPr>
-          <w:sz w:val="20"/>
-        </w:rPr>
-        <w:t>每个价格/元　140　165　206</w:t>
-      </w:r>
-    </w:p>
-    <w:p>
-      <w:pPr>
-        <w:spacing w:after="160" w:line="324" w:lineRule="auto"/>
-        <w:rPr>
-          <w:rFonts w:hint="eastAsia"/>
-        </w:rPr>
-      </w:pPr>
-      <w:r>
-        <w:t xml:space="preserve">　　________________________________________________</w:t>
-      </w:r>
-    </w:p>
-    <w:p>
-      <w:pPr>
-        <w:spacing w:after="160" w:line="324" w:lineRule="auto"/>
-        <w:rPr>
-          <w:rFonts w:hint="eastAsia"/>
-        </w:rPr>
-      </w:pPr>
-      <w:r>
-        <w:t xml:space="preserve">　　________________________________________________</w:t>
-      </w:r>
-    </w:p>
-    <w:p>
-      <w:pPr>
-        <w:spacing w:after="160" w:line="324" w:lineRule="auto"/>
-        <w:rPr>
-          <w:rFonts w:hint="eastAsia"/>
-        </w:rPr>
-      </w:pPr>
-      <w:r>
-        <w:t xml:space="preserve">　　________________________________________________</w:t>
-      </w:r>
-    </w:p>
-    <w:p>
-      <w:pPr>
-        <w:spacing w:after="120" w:line="307" w:lineRule="auto"/>
-        <w:rPr>
-          <w:rFonts w:hint="eastAsia"/>
-        </w:rPr>
-      </w:pPr>
-      <w:r>
-        <w:t>5. 南宋朱熹取《礼记》之《大学》《中庸》篇，分章注释，与《论语》《孟子》合为“四书”。实验小学在美文诵读比赛中，有 42 名同学获得优秀奖，校长准备花 5000 元为这些获奖同学买同样的书作为奖品，每人一套。你认为校长应该选购哪套图书（使剩余的钱尽量少）？买这些奖品一共要花多少元？（7 分）</w:t>
-      </w:r>
-    </w:p>
-    <w:p>
-      <w:pPr>
-        <w:spacing w:after="40" w:line="264" w:lineRule="auto"/>
-        <w:rPr>
-          <w:rFonts w:hint="eastAsia"/>
-        </w:rPr>
-      </w:pPr>
-      <w:r>
-        <w:rPr>
-          <w:color w:val="506E8C"/>
-          <w:sz w:val="18"/>
-        </w:rPr>
-        <w:t>【图：三本书并排。从左到右封面为《孟子》《论语》《大学》，书下价格依次为 158元/套、109元/套、118元/套。】</w:t>
-      </w:r>
-    </w:p>
-    <w:p>
-      <w:pPr>
-        <w:spacing w:after="160" w:line="324" w:lineRule="auto"/>
-        <w:rPr>
-          <w:rFonts w:hint="eastAsia"/>
-        </w:rPr>
-      </w:pPr>
-      <w:r>
-        <w:t xml:space="preserve">　　________________________________________________</w:t>
-      </w:r>
-    </w:p>
-    <w:p>
-      <w:pPr>
-        <w:spacing w:after="160" w:line="324" w:lineRule="auto"/>
-        <w:rPr>
-          <w:rFonts w:hint="eastAsia"/>
-        </w:rPr>
-      </w:pPr>
-      <w:r>
-        <w:t xml:space="preserve">　　________________________________________________</w:t>
-      </w:r>
-    </w:p>
-    <w:p>
-      <w:pPr>
-        <w:spacing w:after="160" w:line="324" w:lineRule="auto"/>
+        <w:spacing w:after="100" w:line="324" w:lineRule="auto"/>
         <w:rPr>
           <w:rFonts w:hint="eastAsia"/>
         </w:rPr>
@@ -2197,31 +2246,31 @@
       </w:rPr>
     </w:lvl>
   </w:abstractNum>
-  <w:num w:numId="1" w16cid:durableId="1733457224">
+  <w:num w:numId="1" w16cid:durableId="2023701218">
     <w:abstractNumId w:val="8"/>
   </w:num>
-  <w:num w:numId="2" w16cid:durableId="1397320822">
+  <w:num w:numId="2" w16cid:durableId="1623463053">
     <w:abstractNumId w:val="6"/>
   </w:num>
-  <w:num w:numId="3" w16cid:durableId="959413790">
+  <w:num w:numId="3" w16cid:durableId="74743193">
     <w:abstractNumId w:val="5"/>
   </w:num>
-  <w:num w:numId="4" w16cid:durableId="954141052">
+  <w:num w:numId="4" w16cid:durableId="1638149526">
     <w:abstractNumId w:val="4"/>
   </w:num>
-  <w:num w:numId="5" w16cid:durableId="1694653793">
+  <w:num w:numId="5" w16cid:durableId="2066173443">
     <w:abstractNumId w:val="7"/>
   </w:num>
-  <w:num w:numId="6" w16cid:durableId="473613">
+  <w:num w:numId="6" w16cid:durableId="1181241266">
     <w:abstractNumId w:val="3"/>
   </w:num>
-  <w:num w:numId="7" w16cid:durableId="430054703">
+  <w:num w:numId="7" w16cid:durableId="258487747">
     <w:abstractNumId w:val="2"/>
   </w:num>
-  <w:num w:numId="8" w16cid:durableId="678194077">
+  <w:num w:numId="8" w16cid:durableId="144049288">
     <w:abstractNumId w:val="1"/>
   </w:num>
-  <w:num w:numId="9" w16cid:durableId="722212158">
+  <w:num w:numId="9" w16cid:durableId="734352767">
     <w:abstractNumId w:val="0"/>
   </w:num>
 </w:numbering>

</xml_diff>

<commit_message>
Retighten A/D midterm figure crops from original photos.
Re-crop diagrams to diagram-only boxes and regenerate both four-page clear exams.

Co-authored-by: Cursor <cursoragent@cursor.com>
</commit_message>
<xml_diff>
--- a/printables/midterm/A-期中综合练习卷/期中综合练习卷.docx
+++ b/printables/midterm/A-期中综合练习卷/期中综合练习卷.docx
@@ -817,8 +817,8 @@
           <w:noProof/>
         </w:rPr>
         <w:drawing>
-          <wp:inline distT="0" distB="0" distL="0" distR="0" wp14:anchorId="24BBC174" wp14:editId="51F94F2A">
-            <wp:extent cx="2125440" cy="1550859"/>
+          <wp:inline distT="0" distB="0" distL="0" distR="0" wp14:anchorId="2BC17282" wp14:editId="3752A97D">
+            <wp:extent cx="2007359" cy="1198014"/>
             <wp:effectExtent l="0" t="0" r="0" b="0"/>
             <wp:docPr id="1" name="Picture 1"/>
             <wp:cNvGraphicFramePr>
@@ -840,7 +840,7 @@
                   <pic:spPr>
                     <a:xfrm>
                       <a:off x="0" y="0"/>
-                      <a:ext cx="2125440" cy="1550859"/>
+                      <a:ext cx="2007359" cy="1198014"/>
                     </a:xfrm>
                     <a:prstGeom prst="rect">
                       <a:avLst/>
@@ -954,7 +954,7 @@
     </w:p>
     <w:p>
       <w:pPr>
-        <w:spacing w:after="80" w:line="288" w:lineRule="auto"/>
+        <w:spacing w:after="160" w:line="312" w:lineRule="auto"/>
         <w:rPr>
           <w:rFonts w:hint="eastAsia"/>
         </w:rPr>
@@ -965,7 +965,7 @@
     </w:p>
     <w:p>
       <w:pPr>
-        <w:spacing w:after="160" w:line="240" w:lineRule="auto"/>
+        <w:spacing w:after="400" w:line="240" w:lineRule="auto"/>
         <w:rPr>
           <w:rFonts w:hint="eastAsia"/>
         </w:rPr>
@@ -973,7 +973,7 @@
     </w:p>
     <w:p>
       <w:pPr>
-        <w:spacing w:after="80" w:line="288" w:lineRule="auto"/>
+        <w:spacing w:after="160" w:line="312" w:lineRule="auto"/>
         <w:rPr>
           <w:rFonts w:hint="eastAsia"/>
         </w:rPr>
@@ -984,7 +984,7 @@
     </w:p>
     <w:p>
       <w:pPr>
-        <w:spacing w:after="160" w:line="240" w:lineRule="auto"/>
+        <w:spacing w:after="400" w:line="240" w:lineRule="auto"/>
         <w:rPr>
           <w:rFonts w:hint="eastAsia"/>
         </w:rPr>
@@ -992,7 +992,7 @@
     </w:p>
     <w:p>
       <w:pPr>
-        <w:spacing w:after="80" w:line="288" w:lineRule="auto"/>
+        <w:spacing w:after="160" w:line="312" w:lineRule="auto"/>
         <w:rPr>
           <w:rFonts w:hint="eastAsia"/>
         </w:rPr>
@@ -1003,7 +1003,7 @@
     </w:p>
     <w:p>
       <w:pPr>
-        <w:spacing w:after="160" w:line="240" w:lineRule="auto"/>
+        <w:spacing w:after="400" w:line="240" w:lineRule="auto"/>
         <w:rPr>
           <w:rFonts w:hint="eastAsia"/>
         </w:rPr>
@@ -1011,7 +1011,7 @@
     </w:p>
     <w:p>
       <w:pPr>
-        <w:spacing w:after="80" w:line="288" w:lineRule="auto"/>
+        <w:spacing w:after="160" w:line="312" w:lineRule="auto"/>
         <w:rPr>
           <w:rFonts w:hint="eastAsia"/>
         </w:rPr>
@@ -1033,10 +1033,10 @@
           <w:noProof/>
         </w:rPr>
         <w:drawing>
-          <wp:inline distT="0" distB="0" distL="0" distR="0" wp14:anchorId="18255C68" wp14:editId="6C56C3F1">
-            <wp:extent cx="1535040" cy="1117145"/>
+          <wp:inline distT="0" distB="0" distL="0" distR="0" wp14:anchorId="433878E1" wp14:editId="68822933">
+            <wp:extent cx="1872000" cy="468837"/>
             <wp:effectExtent l="0" t="0" r="0" b="0"/>
-            <wp:docPr id="980084297" name="Picture 1"/>
+            <wp:docPr id="1998201123" name="Picture 1"/>
             <wp:cNvGraphicFramePr>
               <a:graphicFrameLocks xmlns:a="http://schemas.openxmlformats.org/drawingml/2006/main" noChangeAspect="1"/>
             </wp:cNvGraphicFramePr>
@@ -1056,7 +1056,7 @@
                   <pic:spPr>
                     <a:xfrm>
                       <a:off x="0" y="0"/>
-                      <a:ext cx="1535040" cy="1117145"/>
+                      <a:ext cx="1872000" cy="468837"/>
                     </a:xfrm>
                     <a:prstGeom prst="rect">
                       <a:avLst/>
@@ -1071,7 +1071,7 @@
     </w:p>
     <w:p>
       <w:pPr>
-        <w:spacing w:after="160" w:line="240" w:lineRule="auto"/>
+        <w:spacing w:after="400" w:line="240" w:lineRule="auto"/>
         <w:rPr>
           <w:rFonts w:hint="eastAsia"/>
         </w:rPr>
@@ -1079,7 +1079,7 @@
     </w:p>
     <w:p>
       <w:pPr>
-        <w:spacing w:after="80" w:line="288" w:lineRule="auto"/>
+        <w:spacing w:after="160" w:line="312" w:lineRule="auto"/>
         <w:rPr>
           <w:rFonts w:hint="eastAsia"/>
         </w:rPr>
@@ -1101,8 +1101,8 @@
           <w:noProof/>
         </w:rPr>
         <w:drawing>
-          <wp:inline distT="0" distB="0" distL="0" distR="0" wp14:anchorId="57A7DD4D" wp14:editId="5DE1AA6A">
-            <wp:extent cx="3247200" cy="1217099"/>
+          <wp:inline distT="0" distB="0" distL="0" distR="0" wp14:anchorId="64738515" wp14:editId="3EC564A0">
+            <wp:extent cx="3600000" cy="882581"/>
             <wp:effectExtent l="0" t="0" r="0" b="0"/>
             <wp:docPr id="2" name="Picture 2"/>
             <wp:cNvGraphicFramePr>
@@ -1124,7 +1124,7 @@
                   <pic:spPr>
                     <a:xfrm>
                       <a:off x="0" y="0"/>
-                      <a:ext cx="3247200" cy="1217099"/>
+                      <a:ext cx="3600000" cy="882581"/>
                     </a:xfrm>
                     <a:prstGeom prst="rect">
                       <a:avLst/>
@@ -1139,7 +1139,7 @@
     </w:p>
     <w:p>
       <w:pPr>
-        <w:spacing w:after="40" w:line="288" w:lineRule="auto"/>
+        <w:spacing w:after="120" w:line="312" w:lineRule="auto"/>
         <w:rPr>
           <w:rFonts w:hint="eastAsia"/>
         </w:rPr>
@@ -1150,7 +1150,7 @@
     </w:p>
     <w:p>
       <w:pPr>
-        <w:spacing w:after="160" w:line="240" w:lineRule="auto"/>
+        <w:spacing w:after="400" w:line="240" w:lineRule="auto"/>
         <w:rPr>
           <w:rFonts w:hint="eastAsia"/>
         </w:rPr>
@@ -1158,7 +1158,7 @@
     </w:p>
     <w:p>
       <w:pPr>
-        <w:spacing w:before="80" w:after="60" w:line="288" w:lineRule="auto"/>
+        <w:spacing w:before="140" w:after="60" w:line="312" w:lineRule="auto"/>
         <w:rPr>
           <w:rFonts w:hint="eastAsia"/>
         </w:rPr>
@@ -1174,7 +1174,7 @@
     </w:p>
     <w:p>
       <w:pPr>
-        <w:spacing w:after="80" w:line="288" w:lineRule="auto"/>
+        <w:spacing w:after="160" w:line="312" w:lineRule="auto"/>
         <w:rPr>
           <w:rFonts w:hint="eastAsia"/>
         </w:rPr>
@@ -1185,7 +1185,7 @@
     </w:p>
     <w:p>
       <w:pPr>
-        <w:spacing w:after="40" w:line="288" w:lineRule="auto"/>
+        <w:spacing w:after="120" w:line="312" w:lineRule="auto"/>
         <w:rPr>
           <w:rFonts w:hint="eastAsia"/>
         </w:rPr>
@@ -1196,7 +1196,7 @@
     </w:p>
     <w:p>
       <w:pPr>
-        <w:spacing w:after="80" w:line="288" w:lineRule="auto"/>
+        <w:spacing w:after="160" w:line="312" w:lineRule="auto"/>
         <w:rPr>
           <w:rFonts w:hint="eastAsia"/>
         </w:rPr>
@@ -1207,7 +1207,7 @@
     </w:p>
     <w:p>
       <w:pPr>
-        <w:spacing w:after="40" w:line="288" w:lineRule="auto"/>
+        <w:spacing w:after="120" w:line="312" w:lineRule="auto"/>
         <w:rPr>
           <w:rFonts w:hint="eastAsia"/>
         </w:rPr>
@@ -1218,7 +1218,7 @@
     </w:p>
     <w:p>
       <w:pPr>
-        <w:spacing w:after="80" w:line="288" w:lineRule="auto"/>
+        <w:spacing w:after="160" w:line="312" w:lineRule="auto"/>
         <w:rPr>
           <w:rFonts w:hint="eastAsia"/>
         </w:rPr>
@@ -1240,8 +1240,8 @@
           <w:noProof/>
         </w:rPr>
         <w:drawing>
-          <wp:inline distT="0" distB="0" distL="0" distR="0" wp14:anchorId="35537D60" wp14:editId="5EFD8FAF">
-            <wp:extent cx="3690000" cy="972781"/>
+          <wp:inline distT="0" distB="0" distL="0" distR="0" wp14:anchorId="35B21A7A" wp14:editId="0CAE97AF">
+            <wp:extent cx="4140000" cy="425073"/>
             <wp:effectExtent l="0" t="0" r="0" b="0"/>
             <wp:docPr id="3" name="Picture 3"/>
             <wp:cNvGraphicFramePr>
@@ -1263,7 +1263,7 @@
                   <pic:spPr>
                     <a:xfrm>
                       <a:off x="0" y="0"/>
-                      <a:ext cx="3690000" cy="972781"/>
+                      <a:ext cx="4140000" cy="425073"/>
                     </a:xfrm>
                     <a:prstGeom prst="rect">
                       <a:avLst/>
@@ -1278,7 +1278,7 @@
     </w:p>
     <w:p>
       <w:pPr>
-        <w:spacing w:after="80" w:line="288" w:lineRule="auto"/>
+        <w:spacing w:after="160" w:line="312" w:lineRule="auto"/>
         <w:rPr>
           <w:rFonts w:hint="eastAsia"/>
         </w:rPr>
@@ -1289,7 +1289,7 @@
     </w:p>
     <w:p>
       <w:pPr>
-        <w:spacing w:after="40" w:line="288" w:lineRule="auto"/>
+        <w:spacing w:after="120" w:line="312" w:lineRule="auto"/>
         <w:rPr>
           <w:rFonts w:hint="eastAsia"/>
         </w:rPr>
@@ -1517,10 +1517,10 @@
           <w:noProof/>
         </w:rPr>
         <w:drawing>
-          <wp:inline distT="0" distB="0" distL="0" distR="0" wp14:anchorId="7CD5242B" wp14:editId="17D9848D">
-            <wp:extent cx="2916000" cy="694039"/>
+          <wp:inline distT="0" distB="0" distL="0" distR="0" wp14:anchorId="683F7DCD" wp14:editId="66CA0354">
+            <wp:extent cx="2916000" cy="584357"/>
             <wp:effectExtent l="0" t="0" r="0" b="0"/>
-            <wp:docPr id="1907655800" name="Picture 1"/>
+            <wp:docPr id="2147472625" name="Picture 1"/>
             <wp:cNvGraphicFramePr>
               <a:graphicFrameLocks xmlns:a="http://schemas.openxmlformats.org/drawingml/2006/main" noChangeAspect="1"/>
             </wp:cNvGraphicFramePr>
@@ -1540,7 +1540,7 @@
                   <pic:spPr>
                     <a:xfrm>
                       <a:off x="0" y="0"/>
-                      <a:ext cx="2916000" cy="694039"/>
+                      <a:ext cx="2916000" cy="584357"/>
                     </a:xfrm>
                     <a:prstGeom prst="rect">
                       <a:avLst/>
@@ -1701,10 +1701,10 @@
           <w:noProof/>
         </w:rPr>
         <w:drawing>
-          <wp:inline distT="0" distB="0" distL="0" distR="0" wp14:anchorId="3E961371" wp14:editId="1E74A866">
-            <wp:extent cx="1623600" cy="1217700"/>
+          <wp:inline distT="0" distB="0" distL="0" distR="0" wp14:anchorId="76E66B7A" wp14:editId="00B62714">
+            <wp:extent cx="1623600" cy="642974"/>
             <wp:effectExtent l="0" t="0" r="0" b="0"/>
-            <wp:docPr id="1538109906" name="Picture 1"/>
+            <wp:docPr id="95077882" name="Picture 1"/>
             <wp:cNvGraphicFramePr>
               <a:graphicFrameLocks xmlns:a="http://schemas.openxmlformats.org/drawingml/2006/main" noChangeAspect="1"/>
             </wp:cNvGraphicFramePr>
@@ -1724,7 +1724,7 @@
                   <pic:spPr>
                     <a:xfrm>
                       <a:off x="0" y="0"/>
-                      <a:ext cx="1623600" cy="1217700"/>
+                      <a:ext cx="1623600" cy="642974"/>
                     </a:xfrm>
                     <a:prstGeom prst="rect">
                       <a:avLst/>
@@ -1794,10 +1794,10 @@
           <w:noProof/>
         </w:rPr>
         <w:drawing>
-          <wp:inline distT="0" distB="0" distL="0" distR="0" wp14:anchorId="7C6D1C6E" wp14:editId="00E89DD4">
-            <wp:extent cx="1623600" cy="1068870"/>
+          <wp:inline distT="0" distB="0" distL="0" distR="0" wp14:anchorId="6705D233" wp14:editId="655DE79C">
+            <wp:extent cx="1623600" cy="1443844"/>
             <wp:effectExtent l="0" t="0" r="0" b="0"/>
-            <wp:docPr id="815998521" name="Picture 2"/>
+            <wp:docPr id="574520914" name="Picture 2"/>
             <wp:cNvGraphicFramePr>
               <a:graphicFrameLocks xmlns:a="http://schemas.openxmlformats.org/drawingml/2006/main" noChangeAspect="1"/>
             </wp:cNvGraphicFramePr>
@@ -1817,7 +1817,7 @@
                   <pic:spPr>
                     <a:xfrm>
                       <a:off x="0" y="0"/>
-                      <a:ext cx="1623600" cy="1068870"/>
+                      <a:ext cx="1623600" cy="1443844"/>
                     </a:xfrm>
                     <a:prstGeom prst="rect">
                       <a:avLst/>
@@ -1929,10 +1929,10 @@
           <w:noProof/>
         </w:rPr>
         <w:drawing>
-          <wp:inline distT="0" distB="0" distL="0" distR="0" wp14:anchorId="76FB76D9" wp14:editId="280B62D0">
-            <wp:extent cx="3099600" cy="1351108"/>
+          <wp:inline distT="0" distB="0" distL="0" distR="0" wp14:anchorId="5E8B455B" wp14:editId="1FF08D4D">
+            <wp:extent cx="2804399" cy="1222430"/>
             <wp:effectExtent l="0" t="0" r="0" b="0"/>
-            <wp:docPr id="1504910585" name="Picture 3"/>
+            <wp:docPr id="1748140010" name="Picture 3"/>
             <wp:cNvGraphicFramePr>
               <a:graphicFrameLocks xmlns:a="http://schemas.openxmlformats.org/drawingml/2006/main" noChangeAspect="1"/>
             </wp:cNvGraphicFramePr>
@@ -1952,7 +1952,7 @@
                   <pic:spPr>
                     <a:xfrm>
                       <a:off x="0" y="0"/>
-                      <a:ext cx="3099600" cy="1351108"/>
+                      <a:ext cx="2804399" cy="1222430"/>
                     </a:xfrm>
                     <a:prstGeom prst="rect">
                       <a:avLst/>
@@ -2246,31 +2246,31 @@
       </w:rPr>
     </w:lvl>
   </w:abstractNum>
-  <w:num w:numId="1" w16cid:durableId="2023701218">
+  <w:num w:numId="1" w16cid:durableId="844132350">
     <w:abstractNumId w:val="8"/>
   </w:num>
-  <w:num w:numId="2" w16cid:durableId="1623463053">
+  <w:num w:numId="2" w16cid:durableId="1296957702">
     <w:abstractNumId w:val="6"/>
   </w:num>
-  <w:num w:numId="3" w16cid:durableId="74743193">
+  <w:num w:numId="3" w16cid:durableId="840775417">
     <w:abstractNumId w:val="5"/>
   </w:num>
-  <w:num w:numId="4" w16cid:durableId="1638149526">
+  <w:num w:numId="4" w16cid:durableId="741490771">
     <w:abstractNumId w:val="4"/>
   </w:num>
-  <w:num w:numId="5" w16cid:durableId="2066173443">
+  <w:num w:numId="5" w16cid:durableId="526677385">
     <w:abstractNumId w:val="7"/>
   </w:num>
-  <w:num w:numId="6" w16cid:durableId="1181241266">
+  <w:num w:numId="6" w16cid:durableId="1713921091">
     <w:abstractNumId w:val="3"/>
   </w:num>
-  <w:num w:numId="7" w16cid:durableId="258487747">
+  <w:num w:numId="7" w16cid:durableId="667832033">
     <w:abstractNumId w:val="2"/>
   </w:num>
-  <w:num w:numId="8" w16cid:durableId="144049288">
+  <w:num w:numId="8" w16cid:durableId="1827554981">
     <w:abstractNumId w:val="1"/>
   </w:num>
-  <w:num w:numId="9" w16cid:durableId="734352767">
+  <w:num w:numId="9" w16cid:durableId="743525727">
     <w:abstractNumId w:val="0"/>
   </w:num>
 </w:numbering>

</xml_diff>